<commit_message>
feat: gate installments by approved contract
</commit_message>
<xml_diff>
--- a/web/public/contracts/engagement-depot-progressif-africa-phone.docx
+++ b/web/public/contracts/engagement-depot-progressif-africa-phone.docx
@@ -6,12 +6,11 @@
       <w:tblPr>
         <w:tblW w:type="auto" w:w="0"/>
         <w:jc w:val="center"/>
-        <w:tblLayout w:type="fixed"/>
         <w:tblLook w:firstColumn="1" w:firstRow="1" w:lastColumn="0" w:lastRow="0" w:noHBand="0" w:noVBand="1" w:val="04A0"/>
       </w:tblPr>
       <w:tblGrid>
-        <w:gridCol w:w="1757"/>
-        <w:gridCol w:w="7937"/>
+        <w:gridCol w:w="5355"/>
+        <w:gridCol w:w="5355"/>
       </w:tblGrid>
       <w:tr>
         <w:tc>
@@ -31,13 +30,10 @@
             </w:tcMar>
           </w:tcPr>
           <w:p>
-            <w:pPr>
-              <w:jc w:val="left"/>
-            </w:pPr>
             <w:r>
               <w:drawing>
                 <wp:inline xmlns:a="http://schemas.openxmlformats.org/drawingml/2006/main" xmlns:pic="http://schemas.openxmlformats.org/drawingml/2006/picture">
-                  <wp:extent cx="914400" cy="914400"/>
+                  <wp:extent cx="868680" cy="868680"/>
                   <wp:docPr id="1" name="Picture 1"/>
                   <wp:cNvGraphicFramePr>
                     <a:graphicFrameLocks noChangeAspect="1"/>
@@ -58,7 +54,7 @@
                         <pic:spPr>
                           <a:xfrm>
                             <a:off x="0" y="0"/>
-                            <a:ext cx="914400" cy="914400"/>
+                            <a:ext cx="868680" cy="868680"/>
                           </a:xfrm>
                           <a:prstGeom prst="rect"/>
                         </pic:spPr>
@@ -94,7 +90,6 @@
               <w:rPr>
                 <w:rFonts w:ascii="Manrope" w:hAnsi="Manrope" w:eastAsia="Manrope"/>
                 <w:b/>
-                <w:i w:val="0"/>
                 <w:color w:val="064E3B"/>
                 <w:sz w:val="32"/>
               </w:rPr>
@@ -109,9 +104,8 @@
               <w:rPr>
                 <w:rFonts w:ascii="Manrope" w:hAnsi="Manrope" w:eastAsia="Manrope"/>
                 <w:b w:val="0"/>
-                <w:i w:val="0"/>
                 <w:color w:val="64748B"/>
-                <w:sz w:val="17"/>
+                <w:sz w:val="16"/>
               </w:rPr>
               <w:t>RCCM : RB/ABC/24 B 8356 | IFU : 3202413299289</w:t>
             </w:r>
@@ -124,9 +118,8 @@
               <w:rPr>
                 <w:rFonts w:ascii="Manrope" w:hAnsi="Manrope" w:eastAsia="Manrope"/>
                 <w:b w:val="0"/>
-                <w:i w:val="0"/>
                 <w:color w:val="64748B"/>
-                <w:sz w:val="17"/>
+                <w:sz w:val="16"/>
               </w:rPr>
               <w:t>Tel. : +229 97 05 26 69 | Email : africaphone24@gmail.com</w:t>
             </w:r>
@@ -160,26 +153,22 @@
               <w:end w:w="0" w:type="dxa"/>
             </w:tcMar>
           </w:tcPr>
-          <w:p>
-            <w:r/>
-          </w:p>
+          <w:p/>
         </w:tc>
       </w:tr>
     </w:tbl>
     <w:p>
       <w:pPr>
-        <w:spacing w:before="240" w:after="80"/>
-        <w:jc w:val="left"/>
+        <w:spacing w:before="200"/>
       </w:pPr>
       <w:r>
         <w:rPr>
           <w:rFonts w:ascii="Manrope" w:hAnsi="Manrope" w:eastAsia="Manrope"/>
           <w:b/>
-          <w:i w:val="0"/>
           <w:color w:val="0F172A"/>
           <w:sz w:val="36"/>
         </w:rPr>
-        <w:t>ENGAGEMENT DE D?P?T PROGRESSIF</w:t>
+        <w:t>ENGAGEMENT DE DEPOT PROGRESSIF</w:t>
       </w:r>
     </w:p>
     <w:p>
@@ -187,11 +176,10 @@
         <w:rPr>
           <w:rFonts w:ascii="Manrope" w:hAnsi="Manrope" w:eastAsia="Manrope"/>
           <w:b/>
-          <w:i w:val="0"/>
           <w:color w:val="F97316"/>
-          <w:sz w:val="21"/>
+          <w:sz w:val="20"/>
         </w:rPr>
-        <w:t>Contrat ? imprimer, signer puis r?ins?rer dans le compte client AfricaPhone.</w:t>
+        <w:t>Contrat a imprimer, signer puis reinserer dans le compte client AfricaPhone.</w:t>
       </w:r>
     </w:p>
     <w:p>
@@ -199,17 +187,15 @@
         <w:rPr>
           <w:rFonts w:ascii="Manrope" w:hAnsi="Manrope" w:eastAsia="Manrope"/>
           <w:b w:val="0"/>
-          <w:i w:val="0"/>
           <w:color w:val="0F172A"/>
-          <w:sz w:val="19"/>
+          <w:sz w:val="18"/>
         </w:rPr>
-        <w:t>Je soussign?, Georges GUIDAN, agissant pour le compte de AFRICA PHONE, reconnais recevoir du client ci-dessous d?sign? un d?p?t progressif destin? ? l?achat d?un t?l?phone ou d?un produit disponible chez AFRICA PHONE, selon les conditions ci-apr?s.</w:t>
+        <w:t>Je soussigne, Georges GUIDAN, agissant pour le compte de AFRICA PHONE, reconnais recevoir du client ci-dessous designe un depot progressif destine a l achat d un telephone ou d un produit disponible chez AFRICA PHONE, selon les conditions ci-apres.</w:t>
       </w:r>
     </w:p>
     <w:tbl>
       <w:tblPr>
         <w:tblW w:type="auto" w:w="0"/>
-        <w:jc w:val="center"/>
         <w:tblLook w:firstColumn="1" w:firstRow="1" w:lastColumn="0" w:lastRow="0" w:noHBand="0" w:noVBand="1" w:val="04A0"/>
       </w:tblPr>
       <w:tblGrid>
@@ -227,10 +213,10 @@
               <w:right w:val="single" w:sz="8" w:space="0" w:color="B7E4D3"/>
             </w:tcBorders>
             <w:tcMar>
-              <w:top w:w="180" w:type="dxa"/>
-              <w:start w:w="220" w:type="dxa"/>
-              <w:bottom w:w="180" w:type="dxa"/>
-              <w:end w:w="220" w:type="dxa"/>
+              <w:top w:w="160" w:type="dxa"/>
+              <w:start w:w="200" w:type="dxa"/>
+              <w:bottom w:w="160" w:type="dxa"/>
+              <w:end w:w="200" w:type="dxa"/>
             </w:tcMar>
           </w:tcPr>
           <w:p>
@@ -238,11 +224,10 @@
               <w:rPr>
                 <w:rFonts w:ascii="Manrope" w:hAnsi="Manrope" w:eastAsia="Manrope"/>
                 <w:b/>
-                <w:i w:val="0"/>
                 <w:color w:val="064E3B"/>
-                <w:sz w:val="18"/>
+                <w:sz w:val="17"/>
               </w:rPr>
-              <w:t>PAIEMENT S?CURIS? OBLIGATOIRE</w:t>
+              <w:t>PAIEMENT KKIAPAY OBLIGATOIRE</w:t>
             </w:r>
           </w:p>
           <w:p>
@@ -250,26 +235,20 @@
               <w:rPr>
                 <w:rFonts w:ascii="Manrope" w:hAnsi="Manrope" w:eastAsia="Manrope"/>
                 <w:b/>
-                <w:i w:val="0"/>
                 <w:color w:val="0F172A"/>
-                <w:sz w:val="19"/>
+                <w:sz w:val="18"/>
               </w:rPr>
-              <w:t>Les versements de cotisation se font uniquement par Kkiapay. Chaque versement doit porter une r?f?rence de transaction v?rifiable dans le syst?me AfricaPhone.</w:t>
+              <w:t>Les versements de cotisation se font uniquement par Kkiapay. Chaque versement doit porter une reference de transaction verifiable dans le systeme AfricaPhone.</w:t>
             </w:r>
           </w:p>
         </w:tc>
       </w:tr>
     </w:tbl>
-    <w:p>
-      <w:pPr>
-        <w:spacing w:after="40"/>
-      </w:pPr>
-    </w:p>
+    <w:p/>
     <w:tbl>
       <w:tblPr>
         <w:tblW w:type="auto" w:w="0"/>
         <w:jc w:val="left"/>
-        <w:tblLayout w:type="fixed"/>
         <w:tblLook w:firstColumn="1" w:firstRow="1" w:lastColumn="0" w:lastRow="0" w:noHBand="0" w:noVBand="1" w:val="04A0"/>
       </w:tblPr>
       <w:tblGrid>
@@ -303,7 +282,6 @@
               <w:rPr>
                 <w:rFonts w:ascii="Manrope" w:hAnsi="Manrope" w:eastAsia="Manrope"/>
                 <w:b/>
-                <w:i w:val="0"/>
                 <w:color w:val="FFFFFF"/>
                 <w:sz w:val="22"/>
               </w:rPr>
@@ -333,7 +311,6 @@
               <w:rPr>
                 <w:rFonts w:ascii="Manrope" w:hAnsi="Manrope" w:eastAsia="Manrope"/>
                 <w:b/>
-                <w:i w:val="0"/>
                 <w:color w:val="064E3B"/>
                 <w:sz w:val="21"/>
               </w:rPr>
@@ -347,12 +324,11 @@
       <w:tblPr>
         <w:tblW w:type="auto" w:w="0"/>
         <w:jc w:val="center"/>
-        <w:tblLayout w:type="fixed"/>
         <w:tblLook w:firstColumn="1" w:firstRow="1" w:lastColumn="0" w:lastRow="0" w:noHBand="0" w:noVBand="1" w:val="04A0"/>
       </w:tblPr>
       <w:tblGrid>
-        <w:gridCol w:w="3458"/>
-        <w:gridCol w:w="6123"/>
+        <w:gridCol w:w="5355"/>
+        <w:gridCol w:w="5355"/>
       </w:tblGrid>
       <w:tr>
         <w:tc>
@@ -365,12 +341,11 @@
               <w:right w:val="single" w:sz="8" w:space="0" w:color="DDE7E2"/>
             </w:tcBorders>
             <w:tcMar>
-              <w:top w:w="130" w:type="dxa"/>
-              <w:start w:w="160" w:type="dxa"/>
-              <w:bottom w:w="130" w:type="dxa"/>
-              <w:end w:w="160" w:type="dxa"/>
+              <w:top w:w="120" w:type="dxa"/>
+              <w:start w:w="150" w:type="dxa"/>
+              <w:bottom w:w="120" w:type="dxa"/>
+              <w:end w:w="150" w:type="dxa"/>
             </w:tcMar>
-            <w:vAlign w:val="center"/>
             <w:shd w:fill="F8FAFC"/>
           </w:tcPr>
           <w:p>
@@ -379,11 +354,10 @@
               <w:rPr>
                 <w:rFonts w:ascii="Manrope" w:hAnsi="Manrope" w:eastAsia="Manrope"/>
                 <w:b/>
-                <w:i w:val="0"/>
                 <w:color w:val="64748B"/>
-                <w:sz w:val="18"/>
+                <w:sz w:val="17"/>
               </w:rPr>
-              <w:t>Nom et pr?nom du client</w:t>
+              <w:t>Nom et prenom du client</w:t>
             </w:r>
           </w:p>
         </w:tc>
@@ -397,12 +371,11 @@
               <w:right w:val="single" w:sz="8" w:space="0" w:color="DDE7E2"/>
             </w:tcBorders>
             <w:tcMar>
-              <w:top w:w="130" w:type="dxa"/>
-              <w:start w:w="160" w:type="dxa"/>
-              <w:bottom w:w="130" w:type="dxa"/>
-              <w:end w:w="160" w:type="dxa"/>
+              <w:top w:w="120" w:type="dxa"/>
+              <w:start w:w="150" w:type="dxa"/>
+              <w:bottom w:w="120" w:type="dxa"/>
+              <w:end w:w="150" w:type="dxa"/>
             </w:tcMar>
-            <w:vAlign w:val="center"/>
           </w:tcPr>
           <w:p>
             <w:r/>
@@ -410,9 +383,8 @@
               <w:rPr>
                 <w:rFonts w:ascii="Manrope" w:hAnsi="Manrope" w:eastAsia="Manrope"/>
                 <w:b/>
-                <w:i w:val="0"/>
                 <w:color w:val="0F172A"/>
-                <w:sz w:val="19"/>
+                <w:sz w:val="18"/>
               </w:rPr>
               <w:t>{{CLIENT_NOM_COMPLET}}</w:t>
             </w:r>
@@ -430,12 +402,11 @@
               <w:right w:val="single" w:sz="8" w:space="0" w:color="DDE7E2"/>
             </w:tcBorders>
             <w:tcMar>
-              <w:top w:w="130" w:type="dxa"/>
-              <w:start w:w="160" w:type="dxa"/>
-              <w:bottom w:w="130" w:type="dxa"/>
-              <w:end w:w="160" w:type="dxa"/>
+              <w:top w:w="120" w:type="dxa"/>
+              <w:start w:w="150" w:type="dxa"/>
+              <w:bottom w:w="120" w:type="dxa"/>
+              <w:end w:w="150" w:type="dxa"/>
             </w:tcMar>
-            <w:vAlign w:val="center"/>
             <w:shd w:fill="F8FAFC"/>
           </w:tcPr>
           <w:p>
@@ -444,11 +415,10 @@
               <w:rPr>
                 <w:rFonts w:ascii="Manrope" w:hAnsi="Manrope" w:eastAsia="Manrope"/>
                 <w:b/>
-                <w:i w:val="0"/>
                 <w:color w:val="64748B"/>
-                <w:sz w:val="18"/>
+                <w:sz w:val="17"/>
               </w:rPr>
-              <w:t>T?l?phone / WhatsApp</w:t>
+              <w:t>Telephone / WhatsApp</w:t>
             </w:r>
           </w:p>
         </w:tc>
@@ -462,12 +432,11 @@
               <w:right w:val="single" w:sz="8" w:space="0" w:color="DDE7E2"/>
             </w:tcBorders>
             <w:tcMar>
-              <w:top w:w="130" w:type="dxa"/>
-              <w:start w:w="160" w:type="dxa"/>
-              <w:bottom w:w="130" w:type="dxa"/>
-              <w:end w:w="160" w:type="dxa"/>
+              <w:top w:w="120" w:type="dxa"/>
+              <w:start w:w="150" w:type="dxa"/>
+              <w:bottom w:w="120" w:type="dxa"/>
+              <w:end w:w="150" w:type="dxa"/>
             </w:tcMar>
-            <w:vAlign w:val="center"/>
           </w:tcPr>
           <w:p>
             <w:r/>
@@ -475,9 +444,8 @@
               <w:rPr>
                 <w:rFonts w:ascii="Manrope" w:hAnsi="Manrope" w:eastAsia="Manrope"/>
                 <w:b/>
-                <w:i w:val="0"/>
                 <w:color w:val="0F172A"/>
-                <w:sz w:val="19"/>
+                <w:sz w:val="18"/>
               </w:rPr>
               <w:t>{{CLIENT_WHATSAPP}}</w:t>
             </w:r>
@@ -495,12 +463,11 @@
               <w:right w:val="single" w:sz="8" w:space="0" w:color="DDE7E2"/>
             </w:tcBorders>
             <w:tcMar>
-              <w:top w:w="130" w:type="dxa"/>
-              <w:start w:w="160" w:type="dxa"/>
-              <w:bottom w:w="130" w:type="dxa"/>
-              <w:end w:w="160" w:type="dxa"/>
+              <w:top w:w="120" w:type="dxa"/>
+              <w:start w:w="150" w:type="dxa"/>
+              <w:bottom w:w="120" w:type="dxa"/>
+              <w:end w:w="150" w:type="dxa"/>
             </w:tcMar>
-            <w:vAlign w:val="center"/>
             <w:shd w:fill="F8FAFC"/>
           </w:tcPr>
           <w:p>
@@ -509,11 +476,10 @@
               <w:rPr>
                 <w:rFonts w:ascii="Manrope" w:hAnsi="Manrope" w:eastAsia="Manrope"/>
                 <w:b/>
-                <w:i w:val="0"/>
                 <w:color w:val="64748B"/>
-                <w:sz w:val="18"/>
+                <w:sz w:val="17"/>
               </w:rPr>
-              <w:t>Adresse compl?te</w:t>
+              <w:t>Adresse complete</w:t>
             </w:r>
           </w:p>
         </w:tc>
@@ -527,12 +493,11 @@
               <w:right w:val="single" w:sz="8" w:space="0" w:color="DDE7E2"/>
             </w:tcBorders>
             <w:tcMar>
-              <w:top w:w="130" w:type="dxa"/>
-              <w:start w:w="160" w:type="dxa"/>
-              <w:bottom w:w="130" w:type="dxa"/>
-              <w:end w:w="160" w:type="dxa"/>
+              <w:top w:w="120" w:type="dxa"/>
+              <w:start w:w="150" w:type="dxa"/>
+              <w:bottom w:w="120" w:type="dxa"/>
+              <w:end w:w="150" w:type="dxa"/>
             </w:tcMar>
-            <w:vAlign w:val="center"/>
           </w:tcPr>
           <w:p>
             <w:r/>
@@ -540,9 +505,8 @@
               <w:rPr>
                 <w:rFonts w:ascii="Manrope" w:hAnsi="Manrope" w:eastAsia="Manrope"/>
                 <w:b/>
-                <w:i w:val="0"/>
                 <w:color w:val="0F172A"/>
-                <w:sz w:val="19"/>
+                <w:sz w:val="18"/>
               </w:rPr>
               <w:t>{{CLIENT_ADRESSE}}</w:t>
             </w:r>
@@ -560,12 +524,11 @@
               <w:right w:val="single" w:sz="8" w:space="0" w:color="DDE7E2"/>
             </w:tcBorders>
             <w:tcMar>
-              <w:top w:w="130" w:type="dxa"/>
-              <w:start w:w="160" w:type="dxa"/>
-              <w:bottom w:w="130" w:type="dxa"/>
-              <w:end w:w="160" w:type="dxa"/>
+              <w:top w:w="120" w:type="dxa"/>
+              <w:start w:w="150" w:type="dxa"/>
+              <w:bottom w:w="120" w:type="dxa"/>
+              <w:end w:w="150" w:type="dxa"/>
             </w:tcMar>
-            <w:vAlign w:val="center"/>
             <w:shd w:fill="F8FAFC"/>
           </w:tcPr>
           <w:p>
@@ -574,11 +537,10 @@
               <w:rPr>
                 <w:rFonts w:ascii="Manrope" w:hAnsi="Manrope" w:eastAsia="Manrope"/>
                 <w:b/>
-                <w:i w:val="0"/>
                 <w:color w:val="64748B"/>
-                <w:sz w:val="18"/>
+                <w:sz w:val="17"/>
               </w:rPr>
-              <w:t>Pi?ce d?identit? n?</w:t>
+              <w:t>Piece d identite numero</w:t>
             </w:r>
           </w:p>
         </w:tc>
@@ -592,12 +554,11 @@
               <w:right w:val="single" w:sz="8" w:space="0" w:color="DDE7E2"/>
             </w:tcBorders>
             <w:tcMar>
-              <w:top w:w="130" w:type="dxa"/>
-              <w:start w:w="160" w:type="dxa"/>
-              <w:bottom w:w="130" w:type="dxa"/>
-              <w:end w:w="160" w:type="dxa"/>
+              <w:top w:w="120" w:type="dxa"/>
+              <w:start w:w="150" w:type="dxa"/>
+              <w:bottom w:w="120" w:type="dxa"/>
+              <w:end w:w="150" w:type="dxa"/>
             </w:tcMar>
-            <w:vAlign w:val="center"/>
           </w:tcPr>
           <w:p>
             <w:r/>
@@ -605,9 +566,8 @@
               <w:rPr>
                 <w:rFonts w:ascii="Manrope" w:hAnsi="Manrope" w:eastAsia="Manrope"/>
                 <w:b/>
-                <w:i w:val="0"/>
                 <w:color w:val="0F172A"/>
-                <w:sz w:val="19"/>
+                <w:sz w:val="18"/>
               </w:rPr>
               <w:t>{{PIECE_IDENTITE_NUMERO}}</w:t>
             </w:r>
@@ -625,12 +585,11 @@
               <w:right w:val="single" w:sz="8" w:space="0" w:color="DDE7E2"/>
             </w:tcBorders>
             <w:tcMar>
-              <w:top w:w="130" w:type="dxa"/>
-              <w:start w:w="160" w:type="dxa"/>
-              <w:bottom w:w="130" w:type="dxa"/>
-              <w:end w:w="160" w:type="dxa"/>
+              <w:top w:w="120" w:type="dxa"/>
+              <w:start w:w="150" w:type="dxa"/>
+              <w:bottom w:w="120" w:type="dxa"/>
+              <w:end w:w="150" w:type="dxa"/>
             </w:tcMar>
-            <w:vAlign w:val="center"/>
             <w:shd w:fill="F8FAFC"/>
           </w:tcPr>
           <w:p>
@@ -639,9 +598,8 @@
               <w:rPr>
                 <w:rFonts w:ascii="Manrope" w:hAnsi="Manrope" w:eastAsia="Manrope"/>
                 <w:b/>
-                <w:i w:val="0"/>
                 <w:color w:val="64748B"/>
-                <w:sz w:val="18"/>
+                <w:sz w:val="17"/>
               </w:rPr>
               <w:t>Email</w:t>
             </w:r>
@@ -657,12 +615,11 @@
               <w:right w:val="single" w:sz="8" w:space="0" w:color="DDE7E2"/>
             </w:tcBorders>
             <w:tcMar>
-              <w:top w:w="130" w:type="dxa"/>
-              <w:start w:w="160" w:type="dxa"/>
-              <w:bottom w:w="130" w:type="dxa"/>
-              <w:end w:w="160" w:type="dxa"/>
+              <w:top w:w="120" w:type="dxa"/>
+              <w:start w:w="150" w:type="dxa"/>
+              <w:bottom w:w="120" w:type="dxa"/>
+              <w:end w:w="150" w:type="dxa"/>
             </w:tcMar>
-            <w:vAlign w:val="center"/>
           </w:tcPr>
           <w:p>
             <w:r/>
@@ -670,9 +627,8 @@
               <w:rPr>
                 <w:rFonts w:ascii="Manrope" w:hAnsi="Manrope" w:eastAsia="Manrope"/>
                 <w:b/>
-                <w:i w:val="0"/>
                 <w:color w:val="0F172A"/>
-                <w:sz w:val="19"/>
+                <w:sz w:val="18"/>
               </w:rPr>
               <w:t>{{CLIENT_EMAIL}}</w:t>
             </w:r>
@@ -680,16 +636,11 @@
         </w:tc>
       </w:tr>
     </w:tbl>
-    <w:p>
-      <w:pPr>
-        <w:spacing w:after="40"/>
-      </w:pPr>
-    </w:p>
+    <w:p/>
     <w:tbl>
       <w:tblPr>
         <w:tblW w:type="auto" w:w="0"/>
         <w:jc w:val="left"/>
-        <w:tblLayout w:type="fixed"/>
         <w:tblLook w:firstColumn="1" w:firstRow="1" w:lastColumn="0" w:lastRow="0" w:noHBand="0" w:noVBand="1" w:val="04A0"/>
       </w:tblPr>
       <w:tblGrid>
@@ -723,7 +674,6 @@
               <w:rPr>
                 <w:rFonts w:ascii="Manrope" w:hAnsi="Manrope" w:eastAsia="Manrope"/>
                 <w:b/>
-                <w:i w:val="0"/>
                 <w:color w:val="FFFFFF"/>
                 <w:sz w:val="22"/>
               </w:rPr>
@@ -753,11 +703,10 @@
               <w:rPr>
                 <w:rFonts w:ascii="Manrope" w:hAnsi="Manrope" w:eastAsia="Manrope"/>
                 <w:b/>
-                <w:i w:val="0"/>
                 <w:color w:val="064E3B"/>
                 <w:sz w:val="21"/>
               </w:rPr>
-              <w:t>PRODUIT OU OBJECTIF D?ACHAT</w:t>
+              <w:t>PRODUIT OU OBJECTIF D ACHAT</w:t>
             </w:r>
           </w:p>
         </w:tc>
@@ -767,12 +716,11 @@
       <w:tblPr>
         <w:tblW w:type="auto" w:w="0"/>
         <w:jc w:val="center"/>
-        <w:tblLayout w:type="fixed"/>
         <w:tblLook w:firstColumn="1" w:firstRow="1" w:lastColumn="0" w:lastRow="0" w:noHBand="0" w:noVBand="1" w:val="04A0"/>
       </w:tblPr>
       <w:tblGrid>
-        <w:gridCol w:w="3458"/>
-        <w:gridCol w:w="6123"/>
+        <w:gridCol w:w="5355"/>
+        <w:gridCol w:w="5355"/>
       </w:tblGrid>
       <w:tr>
         <w:tc>
@@ -785,12 +733,11 @@
               <w:right w:val="single" w:sz="8" w:space="0" w:color="DDE7E2"/>
             </w:tcBorders>
             <w:tcMar>
-              <w:top w:w="130" w:type="dxa"/>
-              <w:start w:w="160" w:type="dxa"/>
-              <w:bottom w:w="130" w:type="dxa"/>
-              <w:end w:w="160" w:type="dxa"/>
+              <w:top w:w="120" w:type="dxa"/>
+              <w:start w:w="150" w:type="dxa"/>
+              <w:bottom w:w="120" w:type="dxa"/>
+              <w:end w:w="150" w:type="dxa"/>
             </w:tcMar>
-            <w:vAlign w:val="center"/>
             <w:shd w:fill="F8FAFC"/>
           </w:tcPr>
           <w:p>
@@ -799,11 +746,10 @@
               <w:rPr>
                 <w:rFonts w:ascii="Manrope" w:hAnsi="Manrope" w:eastAsia="Manrope"/>
                 <w:b/>
-                <w:i w:val="0"/>
                 <w:color w:val="64748B"/>
-                <w:sz w:val="18"/>
+                <w:sz w:val="17"/>
               </w:rPr>
-              <w:t>T?l?phone choisi</w:t>
+              <w:t>Telephone choisi</w:t>
             </w:r>
           </w:p>
         </w:tc>
@@ -817,12 +763,11 @@
               <w:right w:val="single" w:sz="8" w:space="0" w:color="DDE7E2"/>
             </w:tcBorders>
             <w:tcMar>
-              <w:top w:w="130" w:type="dxa"/>
-              <w:start w:w="160" w:type="dxa"/>
-              <w:bottom w:w="130" w:type="dxa"/>
-              <w:end w:w="160" w:type="dxa"/>
+              <w:top w:w="120" w:type="dxa"/>
+              <w:start w:w="150" w:type="dxa"/>
+              <w:bottom w:w="120" w:type="dxa"/>
+              <w:end w:w="150" w:type="dxa"/>
             </w:tcMar>
-            <w:vAlign w:val="center"/>
           </w:tcPr>
           <w:p>
             <w:r/>
@@ -830,9 +775,8 @@
               <w:rPr>
                 <w:rFonts w:ascii="Manrope" w:hAnsi="Manrope" w:eastAsia="Manrope"/>
                 <w:b/>
-                <w:i w:val="0"/>
                 <w:color w:val="0F172A"/>
-                <w:sz w:val="19"/>
+                <w:sz w:val="18"/>
               </w:rPr>
               <w:t>{{TELEPHONE_CHOISI}}</w:t>
             </w:r>
@@ -850,12 +794,11 @@
               <w:right w:val="single" w:sz="8" w:space="0" w:color="DDE7E2"/>
             </w:tcBorders>
             <w:tcMar>
-              <w:top w:w="130" w:type="dxa"/>
-              <w:start w:w="160" w:type="dxa"/>
-              <w:bottom w:w="130" w:type="dxa"/>
-              <w:end w:w="160" w:type="dxa"/>
+              <w:top w:w="120" w:type="dxa"/>
+              <w:start w:w="150" w:type="dxa"/>
+              <w:bottom w:w="120" w:type="dxa"/>
+              <w:end w:w="150" w:type="dxa"/>
             </w:tcMar>
-            <w:vAlign w:val="center"/>
             <w:shd w:fill="F8FAFC"/>
           </w:tcPr>
           <w:p>
@@ -864,9 +807,8 @@
               <w:rPr>
                 <w:rFonts w:ascii="Manrope" w:hAnsi="Manrope" w:eastAsia="Manrope"/>
                 <w:b/>
-                <w:i w:val="0"/>
                 <w:color w:val="64748B"/>
-                <w:sz w:val="18"/>
+                <w:sz w:val="17"/>
               </w:rPr>
               <w:t>Couleur</w:t>
             </w:r>
@@ -882,12 +824,11 @@
               <w:right w:val="single" w:sz="8" w:space="0" w:color="DDE7E2"/>
             </w:tcBorders>
             <w:tcMar>
-              <w:top w:w="130" w:type="dxa"/>
-              <w:start w:w="160" w:type="dxa"/>
-              <w:bottom w:w="130" w:type="dxa"/>
-              <w:end w:w="160" w:type="dxa"/>
+              <w:top w:w="120" w:type="dxa"/>
+              <w:start w:w="150" w:type="dxa"/>
+              <w:bottom w:w="120" w:type="dxa"/>
+              <w:end w:w="150" w:type="dxa"/>
             </w:tcMar>
-            <w:vAlign w:val="center"/>
           </w:tcPr>
           <w:p>
             <w:r/>
@@ -895,9 +836,8 @@
               <w:rPr>
                 <w:rFonts w:ascii="Manrope" w:hAnsi="Manrope" w:eastAsia="Manrope"/>
                 <w:b/>
-                <w:i w:val="0"/>
                 <w:color w:val="0F172A"/>
-                <w:sz w:val="19"/>
+                <w:sz w:val="18"/>
               </w:rPr>
               <w:t>{{COULEUR}}</w:t>
             </w:r>
@@ -915,12 +855,11 @@
               <w:right w:val="single" w:sz="8" w:space="0" w:color="DDE7E2"/>
             </w:tcBorders>
             <w:tcMar>
-              <w:top w:w="130" w:type="dxa"/>
-              <w:start w:w="160" w:type="dxa"/>
-              <w:bottom w:w="130" w:type="dxa"/>
-              <w:end w:w="160" w:type="dxa"/>
+              <w:top w:w="120" w:type="dxa"/>
+              <w:start w:w="150" w:type="dxa"/>
+              <w:bottom w:w="120" w:type="dxa"/>
+              <w:end w:w="150" w:type="dxa"/>
             </w:tcMar>
-            <w:vAlign w:val="center"/>
             <w:shd w:fill="F8FAFC"/>
           </w:tcPr>
           <w:p>
@@ -929,11 +868,10 @@
               <w:rPr>
                 <w:rFonts w:ascii="Manrope" w:hAnsi="Manrope" w:eastAsia="Manrope"/>
                 <w:b/>
-                <w:i w:val="0"/>
                 <w:color w:val="64748B"/>
-                <w:sz w:val="18"/>
+                <w:sz w:val="17"/>
               </w:rPr>
-              <w:t>Capacit? / M?moire</w:t>
+              <w:t>Capacite / Memoire</w:t>
             </w:r>
           </w:p>
         </w:tc>
@@ -947,12 +885,11 @@
               <w:right w:val="single" w:sz="8" w:space="0" w:color="DDE7E2"/>
             </w:tcBorders>
             <w:tcMar>
-              <w:top w:w="130" w:type="dxa"/>
-              <w:start w:w="160" w:type="dxa"/>
-              <w:bottom w:w="130" w:type="dxa"/>
-              <w:end w:w="160" w:type="dxa"/>
+              <w:top w:w="120" w:type="dxa"/>
+              <w:start w:w="150" w:type="dxa"/>
+              <w:bottom w:w="120" w:type="dxa"/>
+              <w:end w:w="150" w:type="dxa"/>
             </w:tcMar>
-            <w:vAlign w:val="center"/>
           </w:tcPr>
           <w:p>
             <w:r/>
@@ -960,9 +897,8 @@
               <w:rPr>
                 <w:rFonts w:ascii="Manrope" w:hAnsi="Manrope" w:eastAsia="Manrope"/>
                 <w:b/>
-                <w:i w:val="0"/>
                 <w:color w:val="0F172A"/>
-                <w:sz w:val="19"/>
+                <w:sz w:val="18"/>
               </w:rPr>
               <w:t>{{CAPACITE_MEMOIRE}}</w:t>
             </w:r>
@@ -980,12 +916,11 @@
               <w:right w:val="single" w:sz="8" w:space="0" w:color="DDE7E2"/>
             </w:tcBorders>
             <w:tcMar>
-              <w:top w:w="130" w:type="dxa"/>
-              <w:start w:w="160" w:type="dxa"/>
-              <w:bottom w:w="130" w:type="dxa"/>
-              <w:end w:w="160" w:type="dxa"/>
+              <w:top w:w="120" w:type="dxa"/>
+              <w:start w:w="150" w:type="dxa"/>
+              <w:bottom w:w="120" w:type="dxa"/>
+              <w:end w:w="150" w:type="dxa"/>
             </w:tcMar>
-            <w:vAlign w:val="center"/>
             <w:shd w:fill="F8FAFC"/>
           </w:tcPr>
           <w:p>
@@ -994,9 +929,8 @@
               <w:rPr>
                 <w:rFonts w:ascii="Manrope" w:hAnsi="Manrope" w:eastAsia="Manrope"/>
                 <w:b/>
-                <w:i w:val="0"/>
                 <w:color w:val="64748B"/>
-                <w:sz w:val="18"/>
+                <w:sz w:val="17"/>
               </w:rPr>
               <w:t>Prix cible</w:t>
             </w:r>
@@ -1012,12 +946,11 @@
               <w:right w:val="single" w:sz="8" w:space="0" w:color="DDE7E2"/>
             </w:tcBorders>
             <w:tcMar>
-              <w:top w:w="130" w:type="dxa"/>
-              <w:start w:w="160" w:type="dxa"/>
-              <w:bottom w:w="130" w:type="dxa"/>
-              <w:end w:w="160" w:type="dxa"/>
+              <w:top w:w="120" w:type="dxa"/>
+              <w:start w:w="150" w:type="dxa"/>
+              <w:bottom w:w="120" w:type="dxa"/>
+              <w:end w:w="150" w:type="dxa"/>
             </w:tcMar>
-            <w:vAlign w:val="center"/>
           </w:tcPr>
           <w:p>
             <w:r/>
@@ -1025,9 +958,8 @@
               <w:rPr>
                 <w:rFonts w:ascii="Manrope" w:hAnsi="Manrope" w:eastAsia="Manrope"/>
                 <w:b/>
-                <w:i w:val="0"/>
                 <w:color w:val="0F172A"/>
-                <w:sz w:val="19"/>
+                <w:sz w:val="18"/>
               </w:rPr>
               <w:t>{{PRIX_CIBLE_FCFA}} FCFA</w:t>
             </w:r>
@@ -1045,12 +977,11 @@
               <w:right w:val="single" w:sz="8" w:space="0" w:color="DDE7E2"/>
             </w:tcBorders>
             <w:tcMar>
-              <w:top w:w="130" w:type="dxa"/>
-              <w:start w:w="160" w:type="dxa"/>
-              <w:bottom w:w="130" w:type="dxa"/>
-              <w:end w:w="160" w:type="dxa"/>
+              <w:top w:w="120" w:type="dxa"/>
+              <w:start w:w="150" w:type="dxa"/>
+              <w:bottom w:w="120" w:type="dxa"/>
+              <w:end w:w="150" w:type="dxa"/>
             </w:tcMar>
-            <w:vAlign w:val="center"/>
             <w:shd w:fill="F8FAFC"/>
           </w:tcPr>
           <w:p>
@@ -1059,9 +990,8 @@
               <w:rPr>
                 <w:rFonts w:ascii="Manrope" w:hAnsi="Manrope" w:eastAsia="Manrope"/>
                 <w:b/>
-                <w:i w:val="0"/>
                 <w:color w:val="64748B"/>
-                <w:sz w:val="18"/>
+                <w:sz w:val="17"/>
               </w:rPr>
               <w:t>Produit choisi plus tard</w:t>
             </w:r>
@@ -1077,12 +1007,11 @@
               <w:right w:val="single" w:sz="8" w:space="0" w:color="DDE7E2"/>
             </w:tcBorders>
             <w:tcMar>
-              <w:top w:w="130" w:type="dxa"/>
-              <w:start w:w="160" w:type="dxa"/>
-              <w:bottom w:w="130" w:type="dxa"/>
-              <w:end w:w="160" w:type="dxa"/>
+              <w:top w:w="120" w:type="dxa"/>
+              <w:start w:w="150" w:type="dxa"/>
+              <w:bottom w:w="120" w:type="dxa"/>
+              <w:end w:w="150" w:type="dxa"/>
             </w:tcMar>
-            <w:vAlign w:val="center"/>
           </w:tcPr>
           <w:p>
             <w:r/>
@@ -1090,9 +1019,8 @@
               <w:rPr>
                 <w:rFonts w:ascii="Manrope" w:hAnsi="Manrope" w:eastAsia="Manrope"/>
                 <w:b/>
-                <w:i w:val="0"/>
                 <w:color w:val="0F172A"/>
-                <w:sz w:val="19"/>
+                <w:sz w:val="18"/>
               </w:rPr>
               <w:t>{{CHOIX_PLUS_TARD}}</w:t>
             </w:r>
@@ -1100,16 +1028,11 @@
         </w:tc>
       </w:tr>
     </w:tbl>
-    <w:p>
-      <w:pPr>
-        <w:spacing w:after="40"/>
-      </w:pPr>
-    </w:p>
+    <w:p/>
     <w:tbl>
       <w:tblPr>
         <w:tblW w:type="auto" w:w="0"/>
         <w:jc w:val="left"/>
-        <w:tblLayout w:type="fixed"/>
         <w:tblLook w:firstColumn="1" w:firstRow="1" w:lastColumn="0" w:lastRow="0" w:noHBand="0" w:noVBand="1" w:val="04A0"/>
       </w:tblPr>
       <w:tblGrid>
@@ -1143,7 +1066,6 @@
               <w:rPr>
                 <w:rFonts w:ascii="Manrope" w:hAnsi="Manrope" w:eastAsia="Manrope"/>
                 <w:b/>
-                <w:i w:val="0"/>
                 <w:color w:val="FFFFFF"/>
                 <w:sz w:val="22"/>
               </w:rPr>
@@ -1173,7 +1095,6 @@
               <w:rPr>
                 <w:rFonts w:ascii="Manrope" w:hAnsi="Manrope" w:eastAsia="Manrope"/>
                 <w:b/>
-                <w:i w:val="0"/>
                 <w:color w:val="064E3B"/>
                 <w:sz w:val="21"/>
               </w:rPr>
@@ -1187,12 +1108,11 @@
       <w:tblPr>
         <w:tblW w:type="auto" w:w="0"/>
         <w:jc w:val="center"/>
-        <w:tblLayout w:type="fixed"/>
         <w:tblLook w:firstColumn="1" w:firstRow="1" w:lastColumn="0" w:lastRow="0" w:noHBand="0" w:noVBand="1" w:val="04A0"/>
       </w:tblPr>
       <w:tblGrid>
-        <w:gridCol w:w="3458"/>
-        <w:gridCol w:w="6123"/>
+        <w:gridCol w:w="5355"/>
+        <w:gridCol w:w="5355"/>
       </w:tblGrid>
       <w:tr>
         <w:tc>
@@ -1205,12 +1125,11 @@
               <w:right w:val="single" w:sz="8" w:space="0" w:color="DDE7E2"/>
             </w:tcBorders>
             <w:tcMar>
-              <w:top w:w="130" w:type="dxa"/>
-              <w:start w:w="160" w:type="dxa"/>
-              <w:bottom w:w="130" w:type="dxa"/>
-              <w:end w:w="160" w:type="dxa"/>
+              <w:top w:w="120" w:type="dxa"/>
+              <w:start w:w="150" w:type="dxa"/>
+              <w:bottom w:w="120" w:type="dxa"/>
+              <w:end w:w="150" w:type="dxa"/>
             </w:tcMar>
-            <w:vAlign w:val="center"/>
             <w:shd w:fill="F8FAFC"/>
           </w:tcPr>
           <w:p>
@@ -1219,11 +1138,10 @@
               <w:rPr>
                 <w:rFonts w:ascii="Manrope" w:hAnsi="Manrope" w:eastAsia="Manrope"/>
                 <w:b/>
-                <w:i w:val="0"/>
                 <w:color w:val="64748B"/>
-                <w:sz w:val="18"/>
+                <w:sz w:val="17"/>
               </w:rPr>
-              <w:t>Montant pay? ce jour</w:t>
+              <w:t>Montant paye ce jour</w:t>
             </w:r>
           </w:p>
         </w:tc>
@@ -1237,12 +1155,11 @@
               <w:right w:val="single" w:sz="8" w:space="0" w:color="DDE7E2"/>
             </w:tcBorders>
             <w:tcMar>
-              <w:top w:w="130" w:type="dxa"/>
-              <w:start w:w="160" w:type="dxa"/>
-              <w:bottom w:w="130" w:type="dxa"/>
-              <w:end w:w="160" w:type="dxa"/>
+              <w:top w:w="120" w:type="dxa"/>
+              <w:start w:w="150" w:type="dxa"/>
+              <w:bottom w:w="120" w:type="dxa"/>
+              <w:end w:w="150" w:type="dxa"/>
             </w:tcMar>
-            <w:vAlign w:val="center"/>
           </w:tcPr>
           <w:p>
             <w:r/>
@@ -1250,9 +1167,8 @@
               <w:rPr>
                 <w:rFonts w:ascii="Manrope" w:hAnsi="Manrope" w:eastAsia="Manrope"/>
                 <w:b/>
-                <w:i w:val="0"/>
                 <w:color w:val="0F172A"/>
-                <w:sz w:val="19"/>
+                <w:sz w:val="18"/>
               </w:rPr>
               <w:t>{{MONTANT_PAYE_CE_JOUR}} FCFA</w:t>
             </w:r>
@@ -1270,12 +1186,11 @@
               <w:right w:val="single" w:sz="8" w:space="0" w:color="DDE7E2"/>
             </w:tcBorders>
             <w:tcMar>
-              <w:top w:w="130" w:type="dxa"/>
-              <w:start w:w="160" w:type="dxa"/>
-              <w:bottom w:w="130" w:type="dxa"/>
-              <w:end w:w="160" w:type="dxa"/>
+              <w:top w:w="120" w:type="dxa"/>
+              <w:start w:w="150" w:type="dxa"/>
+              <w:bottom w:w="120" w:type="dxa"/>
+              <w:end w:w="150" w:type="dxa"/>
             </w:tcMar>
-            <w:vAlign w:val="center"/>
             <w:shd w:fill="F8FAFC"/>
           </w:tcPr>
           <w:p>
@@ -1284,9 +1199,8 @@
               <w:rPr>
                 <w:rFonts w:ascii="Manrope" w:hAnsi="Manrope" w:eastAsia="Manrope"/>
                 <w:b/>
-                <w:i w:val="0"/>
                 <w:color w:val="64748B"/>
-                <w:sz w:val="18"/>
+                <w:sz w:val="17"/>
               </w:rPr>
               <w:t>Montant en lettres</w:t>
             </w:r>
@@ -1302,12 +1216,11 @@
               <w:right w:val="single" w:sz="8" w:space="0" w:color="DDE7E2"/>
             </w:tcBorders>
             <w:tcMar>
-              <w:top w:w="130" w:type="dxa"/>
-              <w:start w:w="160" w:type="dxa"/>
-              <w:bottom w:w="130" w:type="dxa"/>
-              <w:end w:w="160" w:type="dxa"/>
+              <w:top w:w="120" w:type="dxa"/>
+              <w:start w:w="150" w:type="dxa"/>
+              <w:bottom w:w="120" w:type="dxa"/>
+              <w:end w:w="150" w:type="dxa"/>
             </w:tcMar>
-            <w:vAlign w:val="center"/>
           </w:tcPr>
           <w:p>
             <w:r/>
@@ -1315,9 +1228,8 @@
               <w:rPr>
                 <w:rFonts w:ascii="Manrope" w:hAnsi="Manrope" w:eastAsia="Manrope"/>
                 <w:b/>
-                <w:i w:val="0"/>
                 <w:color w:val="0F172A"/>
-                <w:sz w:val="19"/>
+                <w:sz w:val="18"/>
               </w:rPr>
               <w:t>{{MONTANT_EN_LETTRES}}</w:t>
             </w:r>
@@ -1335,12 +1247,11 @@
               <w:right w:val="single" w:sz="8" w:space="0" w:color="DDE7E2"/>
             </w:tcBorders>
             <w:tcMar>
-              <w:top w:w="130" w:type="dxa"/>
-              <w:start w:w="160" w:type="dxa"/>
-              <w:bottom w:w="130" w:type="dxa"/>
-              <w:end w:w="160" w:type="dxa"/>
+              <w:top w:w="120" w:type="dxa"/>
+              <w:start w:w="150" w:type="dxa"/>
+              <w:bottom w:w="120" w:type="dxa"/>
+              <w:end w:w="150" w:type="dxa"/>
             </w:tcMar>
-            <w:vAlign w:val="center"/>
             <w:shd w:fill="F8FAFC"/>
           </w:tcPr>
           <w:p>
@@ -1349,9 +1260,8 @@
               <w:rPr>
                 <w:rFonts w:ascii="Manrope" w:hAnsi="Manrope" w:eastAsia="Manrope"/>
                 <w:b/>
-                <w:i w:val="0"/>
                 <w:color w:val="64748B"/>
-                <w:sz w:val="18"/>
+                <w:sz w:val="17"/>
               </w:rPr>
               <w:t>Date du paiement</w:t>
             </w:r>
@@ -1367,12 +1277,11 @@
               <w:right w:val="single" w:sz="8" w:space="0" w:color="DDE7E2"/>
             </w:tcBorders>
             <w:tcMar>
-              <w:top w:w="130" w:type="dxa"/>
-              <w:start w:w="160" w:type="dxa"/>
-              <w:bottom w:w="130" w:type="dxa"/>
-              <w:end w:w="160" w:type="dxa"/>
+              <w:top w:w="120" w:type="dxa"/>
+              <w:start w:w="150" w:type="dxa"/>
+              <w:bottom w:w="120" w:type="dxa"/>
+              <w:end w:w="150" w:type="dxa"/>
             </w:tcMar>
-            <w:vAlign w:val="center"/>
           </w:tcPr>
           <w:p>
             <w:r/>
@@ -1380,9 +1289,8 @@
               <w:rPr>
                 <w:rFonts w:ascii="Manrope" w:hAnsi="Manrope" w:eastAsia="Manrope"/>
                 <w:b/>
-                <w:i w:val="0"/>
                 <w:color w:val="0F172A"/>
-                <w:sz w:val="19"/>
+                <w:sz w:val="18"/>
               </w:rPr>
               <w:t>{{DATE_PAIEMENT}}</w:t>
             </w:r>
@@ -1400,12 +1308,11 @@
               <w:right w:val="single" w:sz="8" w:space="0" w:color="DDE7E2"/>
             </w:tcBorders>
             <w:tcMar>
-              <w:top w:w="130" w:type="dxa"/>
-              <w:start w:w="160" w:type="dxa"/>
-              <w:bottom w:w="130" w:type="dxa"/>
-              <w:end w:w="160" w:type="dxa"/>
+              <w:top w:w="120" w:type="dxa"/>
+              <w:start w:w="150" w:type="dxa"/>
+              <w:bottom w:w="120" w:type="dxa"/>
+              <w:end w:w="150" w:type="dxa"/>
             </w:tcMar>
-            <w:vAlign w:val="center"/>
             <w:shd w:fill="F8FAFC"/>
           </w:tcPr>
           <w:p>
@@ -1414,9 +1321,8 @@
               <w:rPr>
                 <w:rFonts w:ascii="Manrope" w:hAnsi="Manrope" w:eastAsia="Manrope"/>
                 <w:b/>
-                <w:i w:val="0"/>
                 <w:color w:val="64748B"/>
-                <w:sz w:val="18"/>
+                <w:sz w:val="17"/>
               </w:rPr>
               <w:t>Mode de paiement</w:t>
             </w:r>
@@ -1432,12 +1338,11 @@
               <w:right w:val="single" w:sz="8" w:space="0" w:color="DDE7E2"/>
             </w:tcBorders>
             <w:tcMar>
-              <w:top w:w="130" w:type="dxa"/>
-              <w:start w:w="160" w:type="dxa"/>
-              <w:bottom w:w="130" w:type="dxa"/>
-              <w:end w:w="160" w:type="dxa"/>
+              <w:top w:w="120" w:type="dxa"/>
+              <w:start w:w="150" w:type="dxa"/>
+              <w:bottom w:w="120" w:type="dxa"/>
+              <w:end w:w="150" w:type="dxa"/>
             </w:tcMar>
-            <w:vAlign w:val="center"/>
           </w:tcPr>
           <w:p>
             <w:r/>
@@ -1445,9 +1350,8 @@
               <w:rPr>
                 <w:rFonts w:ascii="Manrope" w:hAnsi="Manrope" w:eastAsia="Manrope"/>
                 <w:b/>
-                <w:i w:val="0"/>
                 <w:color w:val="0F172A"/>
-                <w:sz w:val="19"/>
+                <w:sz w:val="18"/>
               </w:rPr>
               <w:t>Kkiapay uniquement</w:t>
             </w:r>
@@ -1465,12 +1369,11 @@
               <w:right w:val="single" w:sz="8" w:space="0" w:color="DDE7E2"/>
             </w:tcBorders>
             <w:tcMar>
-              <w:top w:w="130" w:type="dxa"/>
-              <w:start w:w="160" w:type="dxa"/>
-              <w:bottom w:w="130" w:type="dxa"/>
-              <w:end w:w="160" w:type="dxa"/>
+              <w:top w:w="120" w:type="dxa"/>
+              <w:start w:w="150" w:type="dxa"/>
+              <w:bottom w:w="120" w:type="dxa"/>
+              <w:end w:w="150" w:type="dxa"/>
             </w:tcMar>
-            <w:vAlign w:val="center"/>
             <w:shd w:fill="F8FAFC"/>
           </w:tcPr>
           <w:p>
@@ -1479,11 +1382,10 @@
               <w:rPr>
                 <w:rFonts w:ascii="Manrope" w:hAnsi="Manrope" w:eastAsia="Manrope"/>
                 <w:b/>
-                <w:i w:val="0"/>
                 <w:color w:val="64748B"/>
-                <w:sz w:val="18"/>
+                <w:sz w:val="17"/>
               </w:rPr>
-              <w:t>R?f?rence Kkiapay</w:t>
+              <w:t>Reference Kkiapay</w:t>
             </w:r>
           </w:p>
         </w:tc>
@@ -1497,12 +1399,11 @@
               <w:right w:val="single" w:sz="8" w:space="0" w:color="DDE7E2"/>
             </w:tcBorders>
             <w:tcMar>
-              <w:top w:w="130" w:type="dxa"/>
-              <w:start w:w="160" w:type="dxa"/>
-              <w:bottom w:w="130" w:type="dxa"/>
-              <w:end w:w="160" w:type="dxa"/>
+              <w:top w:w="120" w:type="dxa"/>
+              <w:start w:w="150" w:type="dxa"/>
+              <w:bottom w:w="120" w:type="dxa"/>
+              <w:end w:w="150" w:type="dxa"/>
             </w:tcMar>
-            <w:vAlign w:val="center"/>
           </w:tcPr>
           <w:p>
             <w:r/>
@@ -1510,9 +1411,8 @@
               <w:rPr>
                 <w:rFonts w:ascii="Manrope" w:hAnsi="Manrope" w:eastAsia="Manrope"/>
                 <w:b/>
-                <w:i w:val="0"/>
                 <w:color w:val="0F172A"/>
-                <w:sz w:val="19"/>
+                <w:sz w:val="18"/>
               </w:rPr>
               <w:t>{{REFERENCE_KKIAPAY}}</w:t>
             </w:r>
@@ -1530,12 +1430,11 @@
               <w:right w:val="single" w:sz="8" w:space="0" w:color="DDE7E2"/>
             </w:tcBorders>
             <w:tcMar>
-              <w:top w:w="130" w:type="dxa"/>
-              <w:start w:w="160" w:type="dxa"/>
-              <w:bottom w:w="130" w:type="dxa"/>
-              <w:end w:w="160" w:type="dxa"/>
+              <w:top w:w="120" w:type="dxa"/>
+              <w:start w:w="150" w:type="dxa"/>
+              <w:bottom w:w="120" w:type="dxa"/>
+              <w:end w:w="150" w:type="dxa"/>
             </w:tcMar>
-            <w:vAlign w:val="center"/>
             <w:shd w:fill="F8FAFC"/>
           </w:tcPr>
           <w:p>
@@ -1544,11 +1443,10 @@
               <w:rPr>
                 <w:rFonts w:ascii="Manrope" w:hAnsi="Manrope" w:eastAsia="Manrope"/>
                 <w:b/>
-                <w:i w:val="0"/>
                 <w:color w:val="64748B"/>
-                <w:sz w:val="18"/>
+                <w:sz w:val="17"/>
               </w:rPr>
-              <w:t>Montant d?j? vers?</w:t>
+              <w:t>Montant deja verse</w:t>
             </w:r>
           </w:p>
         </w:tc>
@@ -1562,12 +1460,11 @@
               <w:right w:val="single" w:sz="8" w:space="0" w:color="DDE7E2"/>
             </w:tcBorders>
             <w:tcMar>
-              <w:top w:w="130" w:type="dxa"/>
-              <w:start w:w="160" w:type="dxa"/>
-              <w:bottom w:w="130" w:type="dxa"/>
-              <w:end w:w="160" w:type="dxa"/>
+              <w:top w:w="120" w:type="dxa"/>
+              <w:start w:w="150" w:type="dxa"/>
+              <w:bottom w:w="120" w:type="dxa"/>
+              <w:end w:w="150" w:type="dxa"/>
             </w:tcMar>
-            <w:vAlign w:val="center"/>
           </w:tcPr>
           <w:p>
             <w:r/>
@@ -1575,9 +1472,8 @@
               <w:rPr>
                 <w:rFonts w:ascii="Manrope" w:hAnsi="Manrope" w:eastAsia="Manrope"/>
                 <w:b/>
-                <w:i w:val="0"/>
                 <w:color w:val="0F172A"/>
-                <w:sz w:val="19"/>
+                <w:sz w:val="18"/>
               </w:rPr>
               <w:t>{{MONTANT_TOTAL_VERSE}} FCFA</w:t>
             </w:r>
@@ -1595,12 +1491,11 @@
               <w:right w:val="single" w:sz="8" w:space="0" w:color="DDE7E2"/>
             </w:tcBorders>
             <w:tcMar>
-              <w:top w:w="130" w:type="dxa"/>
-              <w:start w:w="160" w:type="dxa"/>
-              <w:bottom w:w="130" w:type="dxa"/>
-              <w:end w:w="160" w:type="dxa"/>
+              <w:top w:w="120" w:type="dxa"/>
+              <w:start w:w="150" w:type="dxa"/>
+              <w:bottom w:w="120" w:type="dxa"/>
+              <w:end w:w="150" w:type="dxa"/>
             </w:tcMar>
-            <w:vAlign w:val="center"/>
             <w:shd w:fill="F8FAFC"/>
           </w:tcPr>
           <w:p>
@@ -1609,11 +1504,10 @@
               <w:rPr>
                 <w:rFonts w:ascii="Manrope" w:hAnsi="Manrope" w:eastAsia="Manrope"/>
                 <w:b/>
-                <w:i w:val="0"/>
                 <w:color w:val="64748B"/>
-                <w:sz w:val="18"/>
+                <w:sz w:val="17"/>
               </w:rPr>
-              <w:t>Montant restant ? payer</w:t>
+              <w:t>Montant restant a payer</w:t>
             </w:r>
           </w:p>
         </w:tc>
@@ -1627,12 +1521,11 @@
               <w:right w:val="single" w:sz="8" w:space="0" w:color="DDE7E2"/>
             </w:tcBorders>
             <w:tcMar>
-              <w:top w:w="130" w:type="dxa"/>
-              <w:start w:w="160" w:type="dxa"/>
-              <w:bottom w:w="130" w:type="dxa"/>
-              <w:end w:w="160" w:type="dxa"/>
+              <w:top w:w="120" w:type="dxa"/>
+              <w:start w:w="150" w:type="dxa"/>
+              <w:bottom w:w="120" w:type="dxa"/>
+              <w:end w:w="150" w:type="dxa"/>
             </w:tcMar>
-            <w:vAlign w:val="center"/>
           </w:tcPr>
           <w:p>
             <w:r/>
@@ -1640,9 +1533,8 @@
               <w:rPr>
                 <w:rFonts w:ascii="Manrope" w:hAnsi="Manrope" w:eastAsia="Manrope"/>
                 <w:b/>
-                <w:i w:val="0"/>
                 <w:color w:val="0F172A"/>
-                <w:sz w:val="19"/>
+                <w:sz w:val="18"/>
               </w:rPr>
               <w:t>{{MONTANT_RESTANT}} FCFA</w:t>
             </w:r>
@@ -1650,15 +1542,10 @@
         </w:tc>
       </w:tr>
     </w:tbl>
-    <w:p>
-      <w:pPr>
-        <w:spacing w:after="40"/>
-      </w:pPr>
-    </w:p>
+    <w:p/>
     <w:tbl>
       <w:tblPr>
         <w:tblW w:type="auto" w:w="0"/>
-        <w:jc w:val="center"/>
         <w:tblLook w:firstColumn="1" w:firstRow="1" w:lastColumn="0" w:lastRow="0" w:noHBand="0" w:noVBand="1" w:val="04A0"/>
       </w:tblPr>
       <w:tblGrid>
@@ -1676,10 +1563,10 @@
               <w:right w:val="single" w:sz="8" w:space="0" w:color="B7E4D3"/>
             </w:tcBorders>
             <w:tcMar>
-              <w:top w:w="180" w:type="dxa"/>
-              <w:start w:w="220" w:type="dxa"/>
-              <w:bottom w:w="180" w:type="dxa"/>
-              <w:end w:w="220" w:type="dxa"/>
+              <w:top w:w="160" w:type="dxa"/>
+              <w:start w:w="200" w:type="dxa"/>
+              <w:bottom w:w="160" w:type="dxa"/>
+              <w:end w:w="200" w:type="dxa"/>
             </w:tcMar>
           </w:tcPr>
           <w:p>
@@ -1687,11 +1574,10 @@
               <w:rPr>
                 <w:rFonts w:ascii="Manrope" w:hAnsi="Manrope" w:eastAsia="Manrope"/>
                 <w:b/>
-                <w:i w:val="0"/>
                 <w:color w:val="F97316"/>
-                <w:sz w:val="18"/>
+                <w:sz w:val="17"/>
               </w:rPr>
-              <w:t>TRA?ABILIT?</w:t>
+              <w:t>TRACABILITE</w:t>
             </w:r>
           </w:p>
           <w:p>
@@ -1699,26 +1585,20 @@
               <w:rPr>
                 <w:rFonts w:ascii="Manrope" w:hAnsi="Manrope" w:eastAsia="Manrope"/>
                 <w:b/>
-                <w:i w:val="0"/>
                 <w:color w:val="0F172A"/>
-                <w:sz w:val="19"/>
+                <w:sz w:val="18"/>
               </w:rPr>
-              <w:t>Le client peut suivre les versements valid?s dans son espace client. AfricaPhone conserve la r?f?rence Kkiapay, le montant, la date et le statut de chaque paiement.</w:t>
+              <w:t>Le client peut suivre les versements valides dans son espace client. AfricaPhone conserve la reference Kkiapay, le montant, la date et le statut de chaque paiement.</w:t>
             </w:r>
           </w:p>
         </w:tc>
       </w:tr>
     </w:tbl>
-    <w:p>
-      <w:pPr>
-        <w:spacing w:after="40"/>
-      </w:pPr>
-    </w:p>
+    <w:p/>
     <w:tbl>
       <w:tblPr>
         <w:tblW w:type="auto" w:w="0"/>
         <w:jc w:val="left"/>
-        <w:tblLayout w:type="fixed"/>
         <w:tblLook w:firstColumn="1" w:firstRow="1" w:lastColumn="0" w:lastRow="0" w:noHBand="0" w:noVBand="1" w:val="04A0"/>
       </w:tblPr>
       <w:tblGrid>
@@ -1752,7 +1632,6 @@
               <w:rPr>
                 <w:rFonts w:ascii="Manrope" w:hAnsi="Manrope" w:eastAsia="Manrope"/>
                 <w:b/>
-                <w:i w:val="0"/>
                 <w:color w:val="FFFFFF"/>
                 <w:sz w:val="22"/>
               </w:rPr>
@@ -1782,11 +1661,10 @@
               <w:rPr>
                 <w:rFonts w:ascii="Manrope" w:hAnsi="Manrope" w:eastAsia="Manrope"/>
                 <w:b/>
-                <w:i w:val="0"/>
                 <w:color w:val="064E3B"/>
                 <w:sz w:val="21"/>
               </w:rPr>
-              <w:t>CONDITIONS RECONNUES ET ACCEPT?ES PAR LE CLIENT</w:t>
+              <w:t>CONDITIONS RECONNUES ET ACCEPTEES PAR LE CLIENT</w:t>
             </w:r>
           </w:p>
         </w:tc>
@@ -1794,158 +1672,140 @@
     </w:tbl>
     <w:p>
       <w:pPr>
-        <w:spacing w:after="80"/>
         <w:ind w:left="255" w:hanging="142"/>
       </w:pPr>
       <w:r>
         <w:rPr>
           <w:rFonts w:ascii="Manrope" w:hAnsi="Manrope" w:eastAsia="Manrope"/>
           <w:b/>
-          <w:i w:val="0"/>
           <w:color w:val="059669"/>
-          <w:sz w:val="19"/>
+          <w:sz w:val="18"/>
         </w:rPr>
-        <w:t xml:space="preserve">? </w:t>
+        <w:t xml:space="preserve">- </w:t>
       </w:r>
       <w:r>
         <w:rPr>
           <w:rFonts w:ascii="Manrope" w:hAnsi="Manrope" w:eastAsia="Manrope"/>
           <w:b w:val="0"/>
-          <w:i w:val="0"/>
           <w:color w:val="0F172A"/>
           <w:sz w:val="18"/>
         </w:rPr>
-        <w:t>Le paiement effectu? constitue un d?p?t progressif en vue d?un achat chez AFRICA PHONE. Il ne s?agit pas d?une ?pargne, d?un pr?t, ni d?un d?p?t remboursable en argent.</w:t>
+        <w:t>Le paiement effectue constitue un depot progressif en vue d un achat chez AFRICA PHONE. Il ne s agit pas d une epargne, d un pret, ni d un depot remboursable en argent.</w:t>
       </w:r>
     </w:p>
     <w:p>
       <w:pPr>
-        <w:spacing w:after="80"/>
         <w:ind w:left="255" w:hanging="142"/>
       </w:pPr>
       <w:r>
         <w:rPr>
           <w:rFonts w:ascii="Manrope" w:hAnsi="Manrope" w:eastAsia="Manrope"/>
           <w:b/>
-          <w:i w:val="0"/>
           <w:color w:val="059669"/>
-          <w:sz w:val="19"/>
+          <w:sz w:val="18"/>
         </w:rPr>
-        <w:t xml:space="preserve">? </w:t>
+        <w:t xml:space="preserve">- </w:t>
       </w:r>
       <w:r>
         <w:rPr>
           <w:rFonts w:ascii="Manrope" w:hAnsi="Manrope" w:eastAsia="Manrope"/>
           <w:b w:val="0"/>
-          <w:i w:val="0"/>
           <w:color w:val="0F172A"/>
           <w:sz w:val="18"/>
         </w:rPr>
-        <w:t>Les sommes vers?es ne sont pas remboursables en esp?ces. Elles restent utilisables uniquement sous forme de produits chez AFRICA PHONE : t?l?phones, accessoires ou autres articles disponibles.</w:t>
+        <w:t>Les sommes versees ne sont pas remboursables en especes. Elles restent utilisables uniquement sous forme de produits chez AFRICA PHONE : telephones, accessoires ou autres articles disponibles.</w:t>
       </w:r>
     </w:p>
     <w:p>
       <w:pPr>
-        <w:spacing w:after="80"/>
         <w:ind w:left="255" w:hanging="142"/>
       </w:pPr>
       <w:r>
         <w:rPr>
           <w:rFonts w:ascii="Manrope" w:hAnsi="Manrope" w:eastAsia="Manrope"/>
           <w:b/>
-          <w:i w:val="0"/>
           <w:color w:val="059669"/>
-          <w:sz w:val="19"/>
+          <w:sz w:val="18"/>
         </w:rPr>
-        <w:t xml:space="preserve">? </w:t>
+        <w:t xml:space="preserve">- </w:t>
       </w:r>
       <w:r>
         <w:rPr>
           <w:rFonts w:ascii="Manrope" w:hAnsi="Manrope" w:eastAsia="Manrope"/>
           <w:b w:val="0"/>
-          <w:i w:val="0"/>
           <w:color w:val="0F172A"/>
           <w:sz w:val="18"/>
         </w:rPr>
-        <w:t>Le t?l?phone choisi reste soumis ? la disponibilit? du stock au moment o? le paiement total sera atteint. Si le mod?le choisi n?est plus disponible, le client devra choisir un autre produit disponible chez AFRICA PHONE.</w:t>
+        <w:t>Le telephone choisi reste soumis a la disponibilite du stock au moment ou le paiement total sera atteint. Si le modele choisi n est plus disponible, le client devra choisir un autre produit disponible chez AFRICA PHONE.</w:t>
       </w:r>
     </w:p>
     <w:p>
       <w:pPr>
-        <w:spacing w:after="80"/>
         <w:ind w:left="255" w:hanging="142"/>
       </w:pPr>
       <w:r>
         <w:rPr>
           <w:rFonts w:ascii="Manrope" w:hAnsi="Manrope" w:eastAsia="Manrope"/>
           <w:b/>
-          <w:i w:val="0"/>
           <w:color w:val="059669"/>
-          <w:sz w:val="19"/>
+          <w:sz w:val="18"/>
         </w:rPr>
-        <w:t xml:space="preserve">? </w:t>
+        <w:t xml:space="preserve">- </w:t>
       </w:r>
       <w:r>
         <w:rPr>
           <w:rFonts w:ascii="Manrope" w:hAnsi="Manrope" w:eastAsia="Manrope"/>
           <w:b w:val="0"/>
-          <w:i w:val="0"/>
           <w:color w:val="0F172A"/>
           <w:sz w:val="18"/>
         </w:rPr>
-        <w:t>Si le nouveau produit choisi co?te plus cher, le client compl?te la diff?rence. Si le produit choisi co?te moins cher, le solde restant demeure un avoir commercial utilisable uniquement chez AFRICA PHONE.</w:t>
+        <w:t>Si le nouveau produit choisi coute plus cher, le client complete la difference. Si le produit choisi coute moins cher, le solde restant demeure un avoir commercial utilisable uniquement chez AFRICA PHONE.</w:t>
       </w:r>
     </w:p>
     <w:p>
       <w:pPr>
-        <w:spacing w:after="80"/>
         <w:ind w:left="255" w:hanging="142"/>
       </w:pPr>
       <w:r>
         <w:rPr>
           <w:rFonts w:ascii="Manrope" w:hAnsi="Manrope" w:eastAsia="Manrope"/>
           <w:b/>
-          <w:i w:val="0"/>
           <w:color w:val="059669"/>
-          <w:sz w:val="19"/>
+          <w:sz w:val="18"/>
         </w:rPr>
-        <w:t xml:space="preserve">? </w:t>
+        <w:t xml:space="preserve">- </w:t>
       </w:r>
       <w:r>
         <w:rPr>
           <w:rFonts w:ascii="Manrope" w:hAnsi="Manrope" w:eastAsia="Manrope"/>
           <w:b w:val="0"/>
-          <w:i w:val="0"/>
           <w:color w:val="0F172A"/>
           <w:sz w:val="18"/>
         </w:rPr>
-        <w:t>Chaque paiement doit ?tre valid? par Kkiapay et associ? ? une r?f?rence de transaction tra?able.</w:t>
+        <w:t>Chaque paiement doit etre valide par Kkiapay et associe a une reference de transaction tracable.</w:t>
       </w:r>
     </w:p>
     <w:p>
       <w:pPr>
-        <w:spacing w:after="80"/>
         <w:ind w:left="255" w:hanging="142"/>
       </w:pPr>
       <w:r>
         <w:rPr>
           <w:rFonts w:ascii="Manrope" w:hAnsi="Manrope" w:eastAsia="Manrope"/>
           <w:b/>
-          <w:i w:val="0"/>
           <w:color w:val="059669"/>
-          <w:sz w:val="19"/>
+          <w:sz w:val="18"/>
         </w:rPr>
-        <w:t xml:space="preserve">? </w:t>
+        <w:t xml:space="preserve">- </w:t>
       </w:r>
       <w:r>
         <w:rPr>
           <w:rFonts w:ascii="Manrope" w:hAnsi="Manrope" w:eastAsia="Manrope"/>
           <w:b w:val="0"/>
-          <w:i w:val="0"/>
           <w:color w:val="0F172A"/>
           <w:sz w:val="18"/>
         </w:rPr>
-        <w:t>Le t?l?phone remis apr?s paiement complet b?n?ficie d?une garantie d?un an couvrant uniquement les d?fauts de fabrication d?usine. La garantie ne couvre pas les dommages li?s ? l?usage : chute, casse, eau, humidit?, manipulation, surtension ou toute autre cause non imputable ? un d?faut d?usine.</w:t>
+        <w:t>Le telephone remis apres paiement complet beneficie d une garantie d un an couvrant uniquement les defauts de fabrication d usine. La garantie ne couvre pas les dommages lies a l usage : chute, casse, eau, humidite, manipulation, surtension ou toute autre cause non imputable a un defaut d usine.</w:t>
       </w:r>
     </w:p>
     <w:p>
@@ -1956,11 +1816,10 @@
         <w:rPr>
           <w:rFonts w:ascii="Manrope" w:hAnsi="Manrope" w:eastAsia="Manrope"/>
           <w:b/>
-          <w:i w:val="0"/>
           <w:color w:val="0F172A"/>
           <w:sz w:val="19"/>
         </w:rPr>
-        <w:t>Fait ? {{VILLE_SIGNATURE}}, le {{DATE_SIGNATURE}}, en deux exemplaires.</w:t>
+        <w:t>Fait a {{VILLE_SIGNATURE}}, le {{DATE_SIGNATURE}}, en deux exemplaires.</w:t>
       </w:r>
     </w:p>
     <w:tbl>
@@ -1984,9 +1843,9 @@
               <w:right w:val="single" w:sz="8" w:space="0" w:color="DDE7E2"/>
             </w:tcBorders>
             <w:tcMar>
-              <w:top w:w="160" w:type="dxa"/>
+              <w:top w:w="150" w:type="dxa"/>
               <w:start w:w="180" w:type="dxa"/>
-              <w:bottom w:w="160" w:type="dxa"/>
+              <w:bottom w:w="150" w:type="dxa"/>
               <w:end w:w="180" w:type="dxa"/>
             </w:tcMar>
             <w:shd w:fill="059669"/>
@@ -1997,7 +1856,6 @@
               <w:rPr>
                 <w:rFonts w:ascii="Manrope" w:hAnsi="Manrope" w:eastAsia="Manrope"/>
                 <w:b/>
-                <w:i w:val="0"/>
                 <w:color w:val="FFFFFF"/>
                 <w:sz w:val="20"/>
               </w:rPr>
@@ -2015,9 +1873,9 @@
               <w:right w:val="single" w:sz="8" w:space="0" w:color="DDE7E2"/>
             </w:tcBorders>
             <w:tcMar>
-              <w:top w:w="160" w:type="dxa"/>
+              <w:top w:w="150" w:type="dxa"/>
               <w:start w:w="180" w:type="dxa"/>
-              <w:bottom w:w="160" w:type="dxa"/>
+              <w:bottom w:w="150" w:type="dxa"/>
               <w:end w:w="180" w:type="dxa"/>
             </w:tcMar>
             <w:shd w:fill="059669"/>
@@ -2028,7 +1886,6 @@
               <w:rPr>
                 <w:rFonts w:ascii="Manrope" w:hAnsi="Manrope" w:eastAsia="Manrope"/>
                 <w:b/>
-                <w:i w:val="0"/>
                 <w:color w:val="FFFFFF"/>
                 <w:sz w:val="20"/>
               </w:rPr>
@@ -2048,9 +1905,9 @@
               <w:right w:val="single" w:sz="8" w:space="0" w:color="DDE7E2"/>
             </w:tcBorders>
             <w:tcMar>
-              <w:top w:w="160" w:type="dxa"/>
+              <w:top w:w="150" w:type="dxa"/>
               <w:start w:w="180" w:type="dxa"/>
-              <w:bottom w:w="160" w:type="dxa"/>
+              <w:bottom w:w="150" w:type="dxa"/>
               <w:end w:w="180" w:type="dxa"/>
             </w:tcMar>
           </w:tcPr>
@@ -2060,9 +1917,8 @@
               <w:rPr>
                 <w:rFonts w:ascii="Manrope" w:hAnsi="Manrope" w:eastAsia="Manrope"/>
                 <w:b w:val="0"/>
-                <w:i w:val="0"/>
                 <w:color w:val="0F172A"/>
-                <w:sz w:val="19"/>
+                <w:sz w:val="18"/>
               </w:rPr>
               <w:t>Nom : Georges GUIDAN</w:t>
             </w:r>
@@ -2073,11 +1929,10 @@
               <w:rPr>
                 <w:rFonts w:ascii="Manrope" w:hAnsi="Manrope" w:eastAsia="Manrope"/>
                 <w:b w:val="0"/>
-                <w:i w:val="0"/>
                 <w:color w:val="0F172A"/>
-                <w:sz w:val="19"/>
+                <w:sz w:val="18"/>
               </w:rPr>
-              <w:t>Qualit? : Repr?sentant AFRICA PHONE</w:t>
+              <w:t>Qualite : Representant AFRICA PHONE</w:t>
             </w:r>
           </w:p>
         </w:tc>
@@ -2091,9 +1946,9 @@
               <w:right w:val="single" w:sz="8" w:space="0" w:color="DDE7E2"/>
             </w:tcBorders>
             <w:tcMar>
-              <w:top w:w="160" w:type="dxa"/>
+              <w:top w:w="150" w:type="dxa"/>
               <w:start w:w="180" w:type="dxa"/>
-              <w:bottom w:w="160" w:type="dxa"/>
+              <w:bottom w:w="150" w:type="dxa"/>
               <w:end w:w="180" w:type="dxa"/>
             </w:tcMar>
           </w:tcPr>
@@ -2103,11 +1958,10 @@
               <w:rPr>
                 <w:rFonts w:ascii="Manrope" w:hAnsi="Manrope" w:eastAsia="Manrope"/>
                 <w:b w:val="0"/>
-                <w:i w:val="0"/>
                 <w:color w:val="0F172A"/>
-                <w:sz w:val="19"/>
+                <w:sz w:val="18"/>
               </w:rPr>
-              <w:t>Nom et pr?nom : {{CLIENT_NOM_COMPLET}}</w:t>
+              <w:t>Nom et prenom : {{CLIENT_NOM_COMPLET}}</w:t>
             </w:r>
           </w:p>
         </w:tc>
@@ -2123,9 +1977,9 @@
               <w:right w:val="single" w:sz="8" w:space="0" w:color="DDE7E2"/>
             </w:tcBorders>
             <w:tcMar>
-              <w:top w:w="160" w:type="dxa"/>
+              <w:top w:w="150" w:type="dxa"/>
               <w:start w:w="180" w:type="dxa"/>
-              <w:bottom w:w="160" w:type="dxa"/>
+              <w:bottom w:w="150" w:type="dxa"/>
               <w:end w:w="180" w:type="dxa"/>
             </w:tcMar>
           </w:tcPr>
@@ -2135,9 +1989,8 @@
               <w:rPr>
                 <w:rFonts w:ascii="Manrope" w:hAnsi="Manrope" w:eastAsia="Manrope"/>
                 <w:b w:val="0"/>
-                <w:i w:val="0"/>
                 <w:color w:val="0F172A"/>
-                <w:sz w:val="19"/>
+                <w:sz w:val="18"/>
               </w:rPr>
               <w:t>Signature et cachet :</w:t>
             </w:r>
@@ -2153,9 +2006,9 @@
               <w:right w:val="single" w:sz="8" w:space="0" w:color="DDE7E2"/>
             </w:tcBorders>
             <w:tcMar>
-              <w:top w:w="160" w:type="dxa"/>
+              <w:top w:w="150" w:type="dxa"/>
               <w:start w:w="180" w:type="dxa"/>
-              <w:bottom w:w="160" w:type="dxa"/>
+              <w:bottom w:w="150" w:type="dxa"/>
               <w:end w:w="180" w:type="dxa"/>
             </w:tcMar>
           </w:tcPr>
@@ -2165,11 +2018,10 @@
               <w:rPr>
                 <w:rFonts w:ascii="Manrope" w:hAnsi="Manrope" w:eastAsia="Manrope"/>
                 <w:b w:val="0"/>
-                <w:i w:val="0"/>
                 <w:color w:val="0F172A"/>
-                <w:sz w:val="19"/>
+                <w:sz w:val="18"/>
               </w:rPr>
-              <w:t>Signature pr?c?d?e de la mention :</w:t>
+              <w:t>Signature precedee de la mention :</w:t>
             </w:r>
             <w:r>
               <w:br/>
@@ -2178,18 +2030,133 @@
               <w:rPr>
                 <w:rFonts w:ascii="Manrope" w:hAnsi="Manrope" w:eastAsia="Manrope"/>
                 <w:b w:val="0"/>
-                <w:i w:val="0"/>
                 <w:color w:val="0F172A"/>
+                <w:sz w:val="18"/>
+              </w:rPr>
+              <w:t>"Lu et approuve, conditions acceptees."</w:t>
+            </w:r>
+          </w:p>
+        </w:tc>
+      </w:tr>
+    </w:tbl>
+    <w:tbl>
+      <w:tblPr>
+        <w:tblW w:type="auto" w:w="0"/>
+        <w:jc w:val="center"/>
+        <w:tblLook w:firstColumn="1" w:firstRow="1" w:lastColumn="0" w:lastRow="0" w:noHBand="0" w:noVBand="1" w:val="04A0"/>
+      </w:tblPr>
+      <w:tblGrid>
+        <w:gridCol w:w="5355"/>
+        <w:gridCol w:w="5355"/>
+      </w:tblGrid>
+      <w:tr>
+        <w:tc>
+          <w:tcPr>
+            <w:tcW w:type="dxa" w:w="5355"/>
+            <w:tcBorders>
+              <w:top w:val="single" w:sz="6" w:space="0" w:color="DDE7E2"/>
+              <w:left w:val="single" w:sz="6" w:space="0" w:color="DDE7E2"/>
+              <w:bottom w:val="single" w:sz="6" w:space="0" w:color="DDE7E2"/>
+              <w:right w:val="single" w:sz="6" w:space="0" w:color="DDE7E2"/>
+            </w:tcBorders>
+            <w:tcMar>
+              <w:top w:w="120" w:type="dxa"/>
+              <w:start w:w="160" w:type="dxa"/>
+              <w:bottom w:w="120" w:type="dxa"/>
+              <w:end w:w="160" w:type="dxa"/>
+            </w:tcMar>
+          </w:tcPr>
+          <w:p>
+            <w:r>
+              <w:drawing>
+                <wp:inline xmlns:a="http://schemas.openxmlformats.org/drawingml/2006/main" xmlns:pic="http://schemas.openxmlformats.org/drawingml/2006/picture">
+                  <wp:extent cx="960120" cy="960120"/>
+                  <wp:docPr id="2" name="Picture 2"/>
+                  <wp:cNvGraphicFramePr>
+                    <a:graphicFrameLocks noChangeAspect="1"/>
+                  </wp:cNvGraphicFramePr>
+                  <a:graphic>
+                    <a:graphicData uri="http://schemas.openxmlformats.org/drawingml/2006/picture">
+                      <pic:pic>
+                        <pic:nvPicPr>
+                          <pic:cNvPr id="0" name="contract-template-qr.png"/>
+                          <pic:cNvPicPr/>
+                        </pic:nvPicPr>
+                        <pic:blipFill>
+                          <a:blip r:embed="rId10"/>
+                          <a:stretch>
+                            <a:fillRect/>
+                          </a:stretch>
+                        </pic:blipFill>
+                        <pic:spPr>
+                          <a:xfrm>
+                            <a:off x="0" y="0"/>
+                            <a:ext cx="960120" cy="960120"/>
+                          </a:xfrm>
+                          <a:prstGeom prst="rect"/>
+                        </pic:spPr>
+                      </pic:pic>
+                    </a:graphicData>
+                  </a:graphic>
+                </wp:inline>
+              </w:drawing>
+            </w:r>
+          </w:p>
+        </w:tc>
+        <w:tc>
+          <w:tcPr>
+            <w:tcW w:type="dxa" w:w="5355"/>
+            <w:tcBorders>
+              <w:top w:val="single" w:sz="6" w:space="0" w:color="DDE7E2"/>
+              <w:left w:val="single" w:sz="6" w:space="0" w:color="DDE7E2"/>
+              <w:bottom w:val="single" w:sz="6" w:space="0" w:color="DDE7E2"/>
+              <w:right w:val="single" w:sz="6" w:space="0" w:color="DDE7E2"/>
+            </w:tcBorders>
+            <w:tcMar>
+              <w:top w:w="120" w:type="dxa"/>
+              <w:start w:w="160" w:type="dxa"/>
+              <w:bottom w:w="120" w:type="dxa"/>
+              <w:end w:w="160" w:type="dxa"/>
+            </w:tcMar>
+          </w:tcPr>
+          <w:p>
+            <w:r>
+              <w:rPr>
+                <w:rFonts w:ascii="Manrope" w:hAnsi="Manrope" w:eastAsia="Manrope"/>
+                <w:b/>
+                <w:color w:val="064E3B"/>
                 <w:sz w:val="19"/>
               </w:rPr>
-              <w:t>"Lu et approuv?, conditions accept?es."</w:t>
+              <w:t>QR de verification serveur</w:t>
+            </w:r>
+          </w:p>
+          <w:p>
+            <w:r>
+              <w:rPr>
+                <w:rFonts w:ascii="Manrope" w:hAnsi="Manrope" w:eastAsia="Manrope"/>
+                <w:b/>
+                <w:color w:val="0F172A"/>
+                <w:sz w:val="16"/>
+              </w:rPr>
+              <w:t>Code opaque : AFPCT1.TEMPLATE.V1.44380CD07DB3173DE3592219</w:t>
+            </w:r>
+          </w:p>
+          <w:p>
+            <w:r>
+              <w:rPr>
+                <w:rFonts w:ascii="Manrope" w:hAnsi="Manrope" w:eastAsia="Manrope"/>
+                <w:b w:val="0"/>
+                <w:color w:val="64748B"/>
+                <w:sz w:val="16"/>
+              </w:rPr>
+              <w:t>Le QR personnalise du dossier sera controle par AfricaPhone avant activation. Aucun paiement Kkiapay n est autorise sans validation admin du contrat signe.</w:t>
             </w:r>
           </w:p>
         </w:tc>
       </w:tr>
     </w:tbl>
     <w:sectPr>
-      <w:footerReference w:type="default" r:id="rId10"/>
+      <w:footerReference w:type="default" r:id="rId11"/>
       <w:pgSz w:w="12240" w:h="15840"/>
       <w:pgMar w:top="765" w:right="765" w:bottom="765" w:left="765" w:header="720" w:footer="720" w:gutter="0"/>
       <w:cols w:space="720"/>
@@ -2210,11 +2177,10 @@
       <w:rPr>
         <w:rFonts w:ascii="Manrope" w:hAnsi="Manrope" w:eastAsia="Manrope"/>
         <w:b w:val="0"/>
-        <w:i w:val="0"/>
         <w:color w:val="64748B"/>
         <w:sz w:val="16"/>
       </w:rPr>
-      <w:t>AFRICA PHONE - Engagement de d?p?t progressif - Paiements Kkiapay uniquement</w:t>
+      <w:t>AFRICA PHONE - Engagement de depot progressif - Paiements Kkiapay uniquement</w:t>
     </w:r>
   </w:p>
 </w:ftr>

</xml_diff>

<commit_message>
fix: clarify cotisation contract before payment
</commit_message>
<xml_diff>
--- a/web/public/contracts/engagement-depot-progressif-africa-phone.docx
+++ b/web/public/contracts/engagement-depot-progressif-africa-phone.docx
@@ -190,7 +190,7 @@
           <w:color w:val="0F172A"/>
           <w:sz w:val="18"/>
         </w:rPr>
-        <w:t>Je soussigne, Georges GUIDAN, agissant pour le compte de AFRICA PHONE, reconnais recevoir du client ci-dessous designe un depot progressif destine a l achat d un telephone ou d un produit disponible chez AFRICA PHONE, selon les conditions ci-apres.</w:t>
+        <w:t>Le present document fixe les conditions d'ouverture d'un dossier de depot progressif chez AFRICA PHONE. Aucun paiement n'est considere comme recu a la signature du contrat. Le premier versement ne peut etre effectue qu'apres validation du contrat signe par AfricaPhone.</w:t>
       </w:r>
     </w:p>
     <w:tbl>
@@ -238,7 +238,7 @@
                 <w:color w:val="0F172A"/>
                 <w:sz w:val="18"/>
               </w:rPr>
-              <w:t>Les versements de cotisation se font uniquement par Kkiapay. Chaque versement doit porter une reference de transaction verifiable dans le systeme AfricaPhone.</w:t>
+              <w:t>Apres validation du contrat signe, les versements de cotisation se font uniquement par Kkiapay. Chaque versement doit porter une reference de transaction verifiable dans le systeme AfricaPhone.</w:t>
             </w:r>
           </w:p>
         </w:tc>
@@ -540,7 +540,7 @@
                 <w:color w:val="64748B"/>
                 <w:sz w:val="17"/>
               </w:rPr>
-              <w:t>Piece d identite numero</w:t>
+              <w:t>Piece d'identite numero</w:t>
             </w:r>
           </w:p>
         </w:tc>
@@ -706,7 +706,7 @@
                 <w:color w:val="064E3B"/>
                 <w:sz w:val="21"/>
               </w:rPr>
-              <w:t>PRODUIT OU OBJECTIF D ACHAT</w:t>
+              <w:t>PRODUIT OU OBJECTIF D'ACHAT</w:t>
             </w:r>
           </w:p>
         </w:tc>
@@ -1098,7 +1098,7 @@
                 <w:color w:val="064E3B"/>
                 <w:sz w:val="21"/>
               </w:rPr>
-              <w:t>PREMIER VERSEMENT ET SUIVI DE COTISATION</w:t>
+              <w:t>CADRE DE COTISATION</w:t>
             </w:r>
           </w:p>
         </w:tc>
@@ -1141,7 +1141,7 @@
                 <w:color w:val="64748B"/>
                 <w:sz w:val="17"/>
               </w:rPr>
-              <w:t>Montant paye ce jour</w:t>
+              <w:t>Montant total a cotiser</w:t>
             </w:r>
           </w:p>
         </w:tc>
@@ -1170,7 +1170,7 @@
                 <w:color w:val="0F172A"/>
                 <w:sz w:val="18"/>
               </w:rPr>
-              <w:t>{{MONTANT_PAYE_CE_JOUR}} FCFA</w:t>
+              <w:t>{{PRIX_CIBLE_FCFA}} FCFA</w:t>
             </w:r>
           </w:p>
         </w:tc>
@@ -1202,7 +1202,7 @@
                 <w:color w:val="64748B"/>
                 <w:sz w:val="17"/>
               </w:rPr>
-              <w:t>Montant en lettres</w:t>
+              <w:t>Rythme de versement souhaite</w:t>
             </w:r>
           </w:p>
         </w:tc>
@@ -1231,7 +1231,7 @@
                 <w:color w:val="0F172A"/>
                 <w:sz w:val="18"/>
               </w:rPr>
-              <w:t>{{MONTANT_EN_LETTRES}}</w:t>
+              <w:t>{{RYTHME_VERSEMENT}}</w:t>
             </w:r>
           </w:p>
         </w:tc>
@@ -1263,68 +1263,7 @@
                 <w:color w:val="64748B"/>
                 <w:sz w:val="17"/>
               </w:rPr>
-              <w:t>Date du paiement</w:t>
-            </w:r>
-          </w:p>
-        </w:tc>
-        <w:tc>
-          <w:tcPr>
-            <w:tcW w:type="dxa" w:w="5355"/>
-            <w:tcBorders>
-              <w:top w:val="single" w:sz="8" w:space="0" w:color="DDE7E2"/>
-              <w:left w:val="single" w:sz="8" w:space="0" w:color="DDE7E2"/>
-              <w:bottom w:val="single" w:sz="8" w:space="0" w:color="DDE7E2"/>
-              <w:right w:val="single" w:sz="8" w:space="0" w:color="DDE7E2"/>
-            </w:tcBorders>
-            <w:tcMar>
-              <w:top w:w="120" w:type="dxa"/>
-              <w:start w:w="150" w:type="dxa"/>
-              <w:bottom w:w="120" w:type="dxa"/>
-              <w:end w:w="150" w:type="dxa"/>
-            </w:tcMar>
-          </w:tcPr>
-          <w:p>
-            <w:r/>
-            <w:r>
-              <w:rPr>
-                <w:rFonts w:ascii="Manrope" w:hAnsi="Manrope" w:eastAsia="Manrope"/>
-                <w:b/>
-                <w:color w:val="0F172A"/>
-                <w:sz w:val="18"/>
-              </w:rPr>
-              <w:t>{{DATE_PAIEMENT}}</w:t>
-            </w:r>
-          </w:p>
-        </w:tc>
-      </w:tr>
-      <w:tr>
-        <w:tc>
-          <w:tcPr>
-            <w:tcW w:type="dxa" w:w="5355"/>
-            <w:tcBorders>
-              <w:top w:val="single" w:sz="8" w:space="0" w:color="DDE7E2"/>
-              <w:left w:val="single" w:sz="8" w:space="0" w:color="DDE7E2"/>
-              <w:bottom w:val="single" w:sz="8" w:space="0" w:color="DDE7E2"/>
-              <w:right w:val="single" w:sz="8" w:space="0" w:color="DDE7E2"/>
-            </w:tcBorders>
-            <w:tcMar>
-              <w:top w:w="120" w:type="dxa"/>
-              <w:start w:w="150" w:type="dxa"/>
-              <w:bottom w:w="120" w:type="dxa"/>
-              <w:end w:w="150" w:type="dxa"/>
-            </w:tcMar>
-            <w:shd w:fill="F8FAFC"/>
-          </w:tcPr>
-          <w:p>
-            <w:r/>
-            <w:r>
-              <w:rPr>
-                <w:rFonts w:ascii="Manrope" w:hAnsi="Manrope" w:eastAsia="Manrope"/>
-                <w:b/>
-                <w:color w:val="64748B"/>
-                <w:sz w:val="17"/>
-              </w:rPr>
-              <w:t>Mode de paiement</w:t>
+              <w:t>Mode de paiement autorise</w:t>
             </w:r>
           </w:p>
         </w:tc>
@@ -1385,7 +1324,7 @@
                 <w:color w:val="64748B"/>
                 <w:sz w:val="17"/>
               </w:rPr>
-              <w:t>Reference Kkiapay</w:t>
+              <w:t>Activation des versements</w:t>
             </w:r>
           </w:p>
         </w:tc>
@@ -1414,7 +1353,7 @@
                 <w:color w:val="0F172A"/>
                 <w:sz w:val="18"/>
               </w:rPr>
-              <w:t>{{REFERENCE_KKIAPAY}}</w:t>
+              <w:t>Apres validation admin du contrat signe</w:t>
             </w:r>
           </w:p>
         </w:tc>
@@ -1446,7 +1385,7 @@
                 <w:color w:val="64748B"/>
                 <w:sz w:val="17"/>
               </w:rPr>
-              <w:t>Montant deja verse</w:t>
+              <w:t>Reference dossier AfricaPhone</w:t>
             </w:r>
           </w:p>
         </w:tc>
@@ -1475,68 +1414,7 @@
                 <w:color w:val="0F172A"/>
                 <w:sz w:val="18"/>
               </w:rPr>
-              <w:t>{{MONTANT_TOTAL_VERSE}} FCFA</w:t>
-            </w:r>
-          </w:p>
-        </w:tc>
-      </w:tr>
-      <w:tr>
-        <w:tc>
-          <w:tcPr>
-            <w:tcW w:type="dxa" w:w="5355"/>
-            <w:tcBorders>
-              <w:top w:val="single" w:sz="8" w:space="0" w:color="DDE7E2"/>
-              <w:left w:val="single" w:sz="8" w:space="0" w:color="DDE7E2"/>
-              <w:bottom w:val="single" w:sz="8" w:space="0" w:color="DDE7E2"/>
-              <w:right w:val="single" w:sz="8" w:space="0" w:color="DDE7E2"/>
-            </w:tcBorders>
-            <w:tcMar>
-              <w:top w:w="120" w:type="dxa"/>
-              <w:start w:w="150" w:type="dxa"/>
-              <w:bottom w:w="120" w:type="dxa"/>
-              <w:end w:w="150" w:type="dxa"/>
-            </w:tcMar>
-            <w:shd w:fill="F8FAFC"/>
-          </w:tcPr>
-          <w:p>
-            <w:r/>
-            <w:r>
-              <w:rPr>
-                <w:rFonts w:ascii="Manrope" w:hAnsi="Manrope" w:eastAsia="Manrope"/>
-                <w:b/>
-                <w:color w:val="64748B"/>
-                <w:sz w:val="17"/>
-              </w:rPr>
-              <w:t>Montant restant a payer</w:t>
-            </w:r>
-          </w:p>
-        </w:tc>
-        <w:tc>
-          <w:tcPr>
-            <w:tcW w:type="dxa" w:w="5355"/>
-            <w:tcBorders>
-              <w:top w:val="single" w:sz="8" w:space="0" w:color="DDE7E2"/>
-              <w:left w:val="single" w:sz="8" w:space="0" w:color="DDE7E2"/>
-              <w:bottom w:val="single" w:sz="8" w:space="0" w:color="DDE7E2"/>
-              <w:right w:val="single" w:sz="8" w:space="0" w:color="DDE7E2"/>
-            </w:tcBorders>
-            <w:tcMar>
-              <w:top w:w="120" w:type="dxa"/>
-              <w:start w:w="150" w:type="dxa"/>
-              <w:bottom w:w="120" w:type="dxa"/>
-              <w:end w:w="150" w:type="dxa"/>
-            </w:tcMar>
-          </w:tcPr>
-          <w:p>
-            <w:r/>
-            <w:r>
-              <w:rPr>
-                <w:rFonts w:ascii="Manrope" w:hAnsi="Manrope" w:eastAsia="Manrope"/>
-                <w:b/>
-                <w:color w:val="0F172A"/>
-                <w:sz w:val="18"/>
-              </w:rPr>
-              <w:t>{{MONTANT_RESTANT}} FCFA</w:t>
+              <w:t>{{REFERENCE_DOSSIER}}</w:t>
             </w:r>
           </w:p>
         </w:tc>
@@ -1588,7 +1466,7 @@
                 <w:color w:val="0F172A"/>
                 <w:sz w:val="18"/>
               </w:rPr>
-              <w:t>Le client peut suivre les versements valides dans son espace client. AfricaPhone conserve la reference Kkiapay, le montant, la date et le statut de chaque paiement.</w:t>
+              <w:t>Le client pourra suivre les versements valides dans son espace client. AfricaPhone conserve la reference Kkiapay, le montant, la date et le statut de chaque paiement.</w:t>
             </w:r>
           </w:p>
         </w:tc>
@@ -1690,7 +1568,7 @@
           <w:color w:val="0F172A"/>
           <w:sz w:val="18"/>
         </w:rPr>
-        <w:t>Le paiement effectue constitue un depot progressif en vue d un achat chez AFRICA PHONE. Il ne s agit pas d une epargne, d un pret, ni d un depot remboursable en argent.</w:t>
+        <w:t>Le present contrat encadre un depot progressif en vue d'un achat chez AFRICA PHONE. Il ne s'agit pas d'une epargne, d'un pret, ni d'un depot remboursable en argent.</w:t>
       </w:r>
     </w:p>
     <w:p>
@@ -1713,7 +1591,7 @@
           <w:color w:val="0F172A"/>
           <w:sz w:val="18"/>
         </w:rPr>
-        <w:t>Les sommes versees ne sont pas remboursables en especes. Elles restent utilisables uniquement sous forme de produits chez AFRICA PHONE : telephones, accessoires ou autres articles disponibles.</w:t>
+        <w:t>Les sommes versees apres validation du contrat ne sont pas remboursables en especes. Elles restent utilisables uniquement sous forme de produits chez AFRICA PHONE : telephones, accessoires ou autres articles disponibles.</w:t>
       </w:r>
     </w:p>
     <w:p>
@@ -1736,7 +1614,7 @@
           <w:color w:val="0F172A"/>
           <w:sz w:val="18"/>
         </w:rPr>
-        <w:t>Le telephone choisi reste soumis a la disponibilite du stock au moment ou le paiement total sera atteint. Si le modele choisi n est plus disponible, le client devra choisir un autre produit disponible chez AFRICA PHONE.</w:t>
+        <w:t>Le telephone choisi reste soumis a la disponibilite du stock au moment ou le paiement total sera atteint. Si le modele choisi n'est plus disponible, le client devra choisir un autre produit disponible chez AFRICA PHONE.</w:t>
       </w:r>
     </w:p>
     <w:p>
@@ -1782,7 +1660,7 @@
           <w:color w:val="0F172A"/>
           <w:sz w:val="18"/>
         </w:rPr>
-        <w:t>Chaque paiement doit etre valide par Kkiapay et associe a une reference de transaction tracable.</w:t>
+        <w:t>Chaque paiement doit etre effectue par Kkiapay et associe a une reference de transaction tracable.</w:t>
       </w:r>
     </w:p>
     <w:p>
@@ -1805,7 +1683,7 @@
           <w:color w:val="0F172A"/>
           <w:sz w:val="18"/>
         </w:rPr>
-        <w:t>Le telephone remis apres paiement complet beneficie d une garantie d un an couvrant uniquement les defauts de fabrication d usine. La garantie ne couvre pas les dommages lies a l usage : chute, casse, eau, humidite, manipulation, surtension ou toute autre cause non imputable a un defaut d usine.</w:t>
+        <w:t>Le telephone remis apres paiement complet beneficie d'une garantie d'un an couvrant uniquement les defauts de fabrication d'usine. La garantie ne couvre pas les dommages lies a l'usage : chute, casse, eau, humidite, manipulation, surtension ou toute autre cause non imputable a un defaut d'usine.</w:t>
       </w:r>
     </w:p>
     <w:p>
@@ -2039,122 +1917,45 @@
         </w:tc>
       </w:tr>
     </w:tbl>
-    <w:tbl>
-      <w:tblPr>
-        <w:tblW w:type="auto" w:w="0"/>
-        <w:jc w:val="center"/>
-        <w:tblLook w:firstColumn="1" w:firstRow="1" w:lastColumn="0" w:lastRow="0" w:noHBand="0" w:noVBand="1" w:val="04A0"/>
-      </w:tblPr>
-      <w:tblGrid>
-        <w:gridCol w:w="5355"/>
-        <w:gridCol w:w="5355"/>
-      </w:tblGrid>
-      <w:tr>
-        <w:tc>
-          <w:tcPr>
-            <w:tcW w:type="dxa" w:w="5355"/>
-            <w:tcBorders>
-              <w:top w:val="single" w:sz="6" w:space="0" w:color="DDE7E2"/>
-              <w:left w:val="single" w:sz="6" w:space="0" w:color="DDE7E2"/>
-              <w:bottom w:val="single" w:sz="6" w:space="0" w:color="DDE7E2"/>
-              <w:right w:val="single" w:sz="6" w:space="0" w:color="DDE7E2"/>
-            </w:tcBorders>
-            <w:tcMar>
-              <w:top w:w="120" w:type="dxa"/>
-              <w:start w:w="160" w:type="dxa"/>
-              <w:bottom w:w="120" w:type="dxa"/>
-              <w:end w:w="160" w:type="dxa"/>
-            </w:tcMar>
-          </w:tcPr>
-          <w:p>
-            <w:r>
-              <w:drawing>
-                <wp:inline xmlns:a="http://schemas.openxmlformats.org/drawingml/2006/main" xmlns:pic="http://schemas.openxmlformats.org/drawingml/2006/picture">
-                  <wp:extent cx="960120" cy="960120"/>
-                  <wp:docPr id="2" name="Picture 2"/>
-                  <wp:cNvGraphicFramePr>
-                    <a:graphicFrameLocks noChangeAspect="1"/>
-                  </wp:cNvGraphicFramePr>
-                  <a:graphic>
-                    <a:graphicData uri="http://schemas.openxmlformats.org/drawingml/2006/picture">
-                      <pic:pic>
-                        <pic:nvPicPr>
-                          <pic:cNvPr id="0" name="contract-template-qr.png"/>
-                          <pic:cNvPicPr/>
-                        </pic:nvPicPr>
-                        <pic:blipFill>
-                          <a:blip r:embed="rId10"/>
-                          <a:stretch>
-                            <a:fillRect/>
-                          </a:stretch>
-                        </pic:blipFill>
-                        <pic:spPr>
-                          <a:xfrm>
-                            <a:off x="0" y="0"/>
-                            <a:ext cx="960120" cy="960120"/>
-                          </a:xfrm>
-                          <a:prstGeom prst="rect"/>
-                        </pic:spPr>
-                      </pic:pic>
-                    </a:graphicData>
-                  </a:graphic>
-                </wp:inline>
-              </w:drawing>
-            </w:r>
-          </w:p>
-        </w:tc>
-        <w:tc>
-          <w:tcPr>
-            <w:tcW w:type="dxa" w:w="5355"/>
-            <w:tcBorders>
-              <w:top w:val="single" w:sz="6" w:space="0" w:color="DDE7E2"/>
-              <w:left w:val="single" w:sz="6" w:space="0" w:color="DDE7E2"/>
-              <w:bottom w:val="single" w:sz="6" w:space="0" w:color="DDE7E2"/>
-              <w:right w:val="single" w:sz="6" w:space="0" w:color="DDE7E2"/>
-            </w:tcBorders>
-            <w:tcMar>
-              <w:top w:w="120" w:type="dxa"/>
-              <w:start w:w="160" w:type="dxa"/>
-              <w:bottom w:w="120" w:type="dxa"/>
-              <w:end w:w="160" w:type="dxa"/>
-            </w:tcMar>
-          </w:tcPr>
-          <w:p>
-            <w:r>
-              <w:rPr>
-                <w:rFonts w:ascii="Manrope" w:hAnsi="Manrope" w:eastAsia="Manrope"/>
-                <w:b/>
-                <w:color w:val="064E3B"/>
-                <w:sz w:val="19"/>
-              </w:rPr>
-              <w:t>QR de verification serveur</w:t>
-            </w:r>
-          </w:p>
-          <w:p>
-            <w:r>
-              <w:rPr>
-                <w:rFonts w:ascii="Manrope" w:hAnsi="Manrope" w:eastAsia="Manrope"/>
-                <w:b/>
-                <w:color w:val="0F172A"/>
-                <w:sz w:val="16"/>
-              </w:rPr>
-              <w:t>Code opaque : AFPCT1.TEMPLATE.V1.44380CD07DB3173DE3592219</w:t>
-            </w:r>
-          </w:p>
-          <w:p>
-            <w:r>
-              <w:rPr>
-                <w:rFonts w:ascii="Manrope" w:hAnsi="Manrope" w:eastAsia="Manrope"/>
-                <w:b w:val="0"/>
-                <w:color w:val="64748B"/>
-                <w:sz w:val="16"/>
-              </w:rPr>
-              <w:t>Le QR personnalise du dossier sera controle par AfricaPhone avant activation. Aucun paiement Kkiapay n est autorise sans validation admin du contrat signe.</w:t>
-            </w:r>
-          </w:p>
-        </w:tc>
-      </w:tr>
-    </w:tbl>
+    <w:p>
+      <w:pPr>
+        <w:jc w:val="right"/>
+      </w:pPr>
+      <w:r>
+        <w:drawing>
+          <wp:inline xmlns:a="http://schemas.openxmlformats.org/drawingml/2006/main" xmlns:pic="http://schemas.openxmlformats.org/drawingml/2006/picture">
+            <wp:extent cx="868680" cy="868680"/>
+            <wp:docPr id="2" name="Picture 2"/>
+            <wp:cNvGraphicFramePr>
+              <a:graphicFrameLocks noChangeAspect="1"/>
+            </wp:cNvGraphicFramePr>
+            <a:graphic>
+              <a:graphicData uri="http://schemas.openxmlformats.org/drawingml/2006/picture">
+                <pic:pic>
+                  <pic:nvPicPr>
+                    <pic:cNvPr id="0" name="contract-template-qr.png"/>
+                    <pic:cNvPicPr/>
+                  </pic:nvPicPr>
+                  <pic:blipFill>
+                    <a:blip r:embed="rId10"/>
+                    <a:stretch>
+                      <a:fillRect/>
+                    </a:stretch>
+                  </pic:blipFill>
+                  <pic:spPr>
+                    <a:xfrm>
+                      <a:off x="0" y="0"/>
+                      <a:ext cx="868680" cy="868680"/>
+                    </a:xfrm>
+                    <a:prstGeom prst="rect"/>
+                  </pic:spPr>
+                </pic:pic>
+              </a:graphicData>
+            </a:graphic>
+          </wp:inline>
+        </w:drawing>
+      </w:r>
+    </w:p>
     <w:sectPr>
       <w:footerReference w:type="default" r:id="rId11"/>
       <w:pgSz w:w="12240" w:h="15840"/>

</xml_diff>

<commit_message>
fix: move contract qr to header
</commit_message>
<xml_diff>
--- a/web/public/contracts/engagement-depot-progressif-africa-phone.docx
+++ b/web/public/contracts/engagement-depot-progressif-africa-phone.docx
@@ -9,13 +9,14 @@
         <w:tblLook w:firstColumn="1" w:firstRow="1" w:lastColumn="0" w:lastRow="0" w:noHBand="0" w:noVBand="1" w:val="04A0"/>
       </w:tblPr>
       <w:tblGrid>
-        <w:gridCol w:w="5355"/>
-        <w:gridCol w:w="5355"/>
+        <w:gridCol w:w="1361"/>
+        <w:gridCol w:w="1134"/>
+        <w:gridCol w:w="7143"/>
       </w:tblGrid>
       <w:tr>
         <w:tc>
           <w:tcPr>
-            <w:tcW w:type="dxa" w:w="5355"/>
+            <w:tcW w:type="dxa" w:w="3570"/>
             <w:tcBorders>
               <w:top w:val="single" w:sz="0" w:space="0" w:color="FFFFFF"/>
               <w:left w:val="single" w:sz="0" w:space="0" w:color="FFFFFF"/>
@@ -24,16 +25,17 @@
             </w:tcBorders>
             <w:tcMar>
               <w:top w:w="40" w:type="dxa"/>
-              <w:start w:w="60" w:type="dxa"/>
+              <w:start w:w="40" w:type="dxa"/>
               <w:bottom w:w="40" w:type="dxa"/>
-              <w:end w:w="60" w:type="dxa"/>
+              <w:end w:w="40" w:type="dxa"/>
             </w:tcMar>
+            <w:vAlign w:val="center"/>
           </w:tcPr>
           <w:p>
             <w:r>
               <w:drawing>
                 <wp:inline xmlns:a="http://schemas.openxmlformats.org/drawingml/2006/main" xmlns:pic="http://schemas.openxmlformats.org/drawingml/2006/picture">
-                  <wp:extent cx="868680" cy="868680"/>
+                  <wp:extent cx="777240" cy="777240"/>
                   <wp:docPr id="1" name="Picture 1"/>
                   <wp:cNvGraphicFramePr>
                     <a:graphicFrameLocks noChangeAspect="1"/>
@@ -54,7 +56,7 @@
                         <pic:spPr>
                           <a:xfrm>
                             <a:off x="0" y="0"/>
-                            <a:ext cx="868680" cy="868680"/>
+                            <a:ext cx="777240" cy="777240"/>
                           </a:xfrm>
                           <a:prstGeom prst="rect"/>
                         </pic:spPr>
@@ -68,7 +70,7 @@
         </w:tc>
         <w:tc>
           <w:tcPr>
-            <w:tcW w:type="dxa" w:w="5355"/>
+            <w:tcW w:type="dxa" w:w="3570"/>
             <w:tcBorders>
               <w:top w:val="single" w:sz="0" w:space="0" w:color="FFFFFF"/>
               <w:left w:val="single" w:sz="0" w:space="0" w:color="FFFFFF"/>
@@ -77,10 +79,68 @@
             </w:tcBorders>
             <w:tcMar>
               <w:top w:w="40" w:type="dxa"/>
-              <w:start w:w="60" w:type="dxa"/>
+              <w:start w:w="40" w:type="dxa"/>
               <w:bottom w:w="40" w:type="dxa"/>
-              <w:end w:w="60" w:type="dxa"/>
+              <w:end w:w="40" w:type="dxa"/>
             </w:tcMar>
+            <w:vAlign w:val="center"/>
+          </w:tcPr>
+          <w:p>
+            <w:pPr>
+              <w:jc w:val="left"/>
+            </w:pPr>
+            <w:r>
+              <w:drawing>
+                <wp:inline xmlns:a="http://schemas.openxmlformats.org/drawingml/2006/main" xmlns:pic="http://schemas.openxmlformats.org/drawingml/2006/picture">
+                  <wp:extent cx="713232" cy="713232"/>
+                  <wp:docPr id="2" name="Picture 2"/>
+                  <wp:cNvGraphicFramePr>
+                    <a:graphicFrameLocks noChangeAspect="1"/>
+                  </wp:cNvGraphicFramePr>
+                  <a:graphic>
+                    <a:graphicData uri="http://schemas.openxmlformats.org/drawingml/2006/picture">
+                      <pic:pic>
+                        <pic:nvPicPr>
+                          <pic:cNvPr id="0" name="contract-template-qr.png"/>
+                          <pic:cNvPicPr/>
+                        </pic:nvPicPr>
+                        <pic:blipFill>
+                          <a:blip r:embed="rId10"/>
+                          <a:stretch>
+                            <a:fillRect/>
+                          </a:stretch>
+                        </pic:blipFill>
+                        <pic:spPr>
+                          <a:xfrm>
+                            <a:off x="0" y="0"/>
+                            <a:ext cx="713232" cy="713232"/>
+                          </a:xfrm>
+                          <a:prstGeom prst="rect"/>
+                        </pic:spPr>
+                      </pic:pic>
+                    </a:graphicData>
+                  </a:graphic>
+                </wp:inline>
+              </w:drawing>
+            </w:r>
+          </w:p>
+        </w:tc>
+        <w:tc>
+          <w:tcPr>
+            <w:tcW w:type="dxa" w:w="3570"/>
+            <w:tcBorders>
+              <w:top w:val="single" w:sz="0" w:space="0" w:color="FFFFFF"/>
+              <w:left w:val="single" w:sz="0" w:space="0" w:color="FFFFFF"/>
+              <w:bottom w:val="single" w:sz="0" w:space="0" w:color="FFFFFF"/>
+              <w:right w:val="single" w:sz="0" w:space="0" w:color="FFFFFF"/>
+            </w:tcBorders>
+            <w:tcMar>
+              <w:top w:w="40" w:type="dxa"/>
+              <w:start w:w="40" w:type="dxa"/>
+              <w:bottom w:w="40" w:type="dxa"/>
+              <w:end w:w="40" w:type="dxa"/>
+            </w:tcMar>
+            <w:vAlign w:val="center"/>
           </w:tcPr>
           <w:p>
             <w:pPr>
@@ -1917,45 +1977,6 @@
         </w:tc>
       </w:tr>
     </w:tbl>
-    <w:p>
-      <w:pPr>
-        <w:jc w:val="right"/>
-      </w:pPr>
-      <w:r>
-        <w:drawing>
-          <wp:inline xmlns:a="http://schemas.openxmlformats.org/drawingml/2006/main" xmlns:pic="http://schemas.openxmlformats.org/drawingml/2006/picture">
-            <wp:extent cx="868680" cy="868680"/>
-            <wp:docPr id="2" name="Picture 2"/>
-            <wp:cNvGraphicFramePr>
-              <a:graphicFrameLocks noChangeAspect="1"/>
-            </wp:cNvGraphicFramePr>
-            <a:graphic>
-              <a:graphicData uri="http://schemas.openxmlformats.org/drawingml/2006/picture">
-                <pic:pic>
-                  <pic:nvPicPr>
-                    <pic:cNvPr id="0" name="contract-template-qr.png"/>
-                    <pic:cNvPicPr/>
-                  </pic:nvPicPr>
-                  <pic:blipFill>
-                    <a:blip r:embed="rId10"/>
-                    <a:stretch>
-                      <a:fillRect/>
-                    </a:stretch>
-                  </pic:blipFill>
-                  <pic:spPr>
-                    <a:xfrm>
-                      <a:off x="0" y="0"/>
-                      <a:ext cx="868680" cy="868680"/>
-                    </a:xfrm>
-                    <a:prstGeom prst="rect"/>
-                  </pic:spPr>
-                </pic:pic>
-              </a:graphicData>
-            </a:graphic>
-          </wp:inline>
-        </w:drawing>
-      </w:r>
-    </w:p>
     <w:sectPr>
       <w:footerReference w:type="default" r:id="rId11"/>
       <w:pgSz w:w="12240" w:h="15840"/>

</xml_diff>